<commit_message>
Added new results in benchmark_comparison
</commit_message>
<xml_diff>
--- a/Evaluations/BenchmarkEvaluations/BenchmarkComparison.docx
+++ b/Evaluations/BenchmarkEvaluations/BenchmarkComparison.docx
@@ -167,6 +167,7 @@
                 <w:szCs w:val="18"/>
               </w:rPr>
             </w:pPr>
+            <w:proofErr w:type="spellStart"/>
             <w:r>
               <w:rPr>
                 <w:rFonts w:asciiTheme="majorHAnsi" w:hAnsiTheme="majorHAnsi" w:cstheme="majorHAnsi"/>
@@ -176,7 +177,19 @@
                 <w:sz w:val="18"/>
                 <w:szCs w:val="18"/>
               </w:rPr>
-              <w:t>LLaMA 3.2-3B-Instruct</w:t>
+              <w:t>LLaMA</w:t>
+            </w:r>
+            <w:proofErr w:type="spellEnd"/>
+            <w:r>
+              <w:rPr>
+                <w:rFonts w:asciiTheme="majorHAnsi" w:hAnsiTheme="majorHAnsi" w:cstheme="majorHAnsi"/>
+                <w:b/>
+                <w:bCs/>
+                <w:color w:val="000000" w:themeColor="text1"/>
+                <w:sz w:val="18"/>
+                <w:szCs w:val="18"/>
+              </w:rPr>
+              <w:t xml:space="preserve"> 3.2-3B-Instruct</w:t>
             </w:r>
           </w:p>
         </w:tc>
@@ -757,6 +770,7 @@
                 <w:szCs w:val="18"/>
               </w:rPr>
             </w:pPr>
+            <w:proofErr w:type="spellStart"/>
             <w:r>
               <w:rPr>
                 <w:rFonts w:asciiTheme="majorHAnsi" w:hAnsiTheme="majorHAnsi" w:cstheme="majorHAnsi"/>
@@ -768,6 +782,7 @@
               </w:rPr>
               <w:t>IFEval</w:t>
             </w:r>
+            <w:proofErr w:type="spellEnd"/>
           </w:p>
         </w:tc>
         <w:tc>
@@ -801,8 +816,9 @@
                 <w:sz w:val="11"/>
                 <w:szCs w:val="11"/>
               </w:rPr>
-              <w:t>GSM8K CoT</w:t>
-            </w:r>
+              <w:t xml:space="preserve">GSM8K </w:t>
+            </w:r>
+            <w:proofErr w:type="spellStart"/>
             <w:r>
               <w:rPr>
                 <w:rFonts w:asciiTheme="majorHAnsi" w:hAnsiTheme="majorHAnsi" w:cstheme="majorHAnsi"/>
@@ -812,6 +828,18 @@
                 <w:sz w:val="11"/>
                 <w:szCs w:val="11"/>
               </w:rPr>
+              <w:t>CoT</w:t>
+            </w:r>
+            <w:proofErr w:type="spellEnd"/>
+            <w:r>
+              <w:rPr>
+                <w:rFonts w:asciiTheme="majorHAnsi" w:hAnsiTheme="majorHAnsi" w:cstheme="majorHAnsi"/>
+                <w:b/>
+                <w:bCs/>
+                <w:color w:val="000000" w:themeColor="text1"/>
+                <w:sz w:val="11"/>
+                <w:szCs w:val="11"/>
+              </w:rPr>
               <w:br/>
               <w:t>(8-shot)</w:t>
             </w:r>
@@ -919,32 +947,9 @@
                 <w:szCs w:val="11"/>
               </w:rPr>
               <w:br/>
-              <w:t>(WikiText)</w:t>
-            </w:r>
-          </w:p>
-        </w:tc>
-        <w:tc>
-          <w:tcPr>
-            <w:tcW w:w="869" w:type="dxa"/>
-            <w:shd w:val="clear" w:color="auto" w:fill="E36C0A" w:themeFill="accent6" w:themeFillShade="BF"/>
-            <w:tcMar>
-              <w:top w:w="80" w:type="dxa"/>
-              <w:left w:w="60" w:type="dxa"/>
-              <w:bottom w:w="80" w:type="dxa"/>
-              <w:right w:w="60" w:type="dxa"/>
-            </w:tcMar>
-            <w:vAlign w:val="center"/>
-          </w:tcPr>
-          <w:p>
-            <w:pPr>
-              <w:jc w:val="center"/>
-              <w:rPr>
-                <w:rFonts w:asciiTheme="majorHAnsi" w:hAnsiTheme="majorHAnsi" w:cstheme="majorHAnsi"/>
-                <w:color w:val="000000" w:themeColor="text1"/>
-                <w:sz w:val="18"/>
-                <w:szCs w:val="18"/>
-              </w:rPr>
-            </w:pPr>
+              <w:t>(</w:t>
+            </w:r>
+            <w:proofErr w:type="spellStart"/>
             <w:r>
               <w:rPr>
                 <w:rFonts w:asciiTheme="majorHAnsi" w:hAnsiTheme="majorHAnsi" w:cstheme="majorHAnsi"/>
@@ -954,8 +959,9 @@
                 <w:sz w:val="11"/>
                 <w:szCs w:val="11"/>
               </w:rPr>
-              <w:t>MMLU</w:t>
-            </w:r>
+              <w:t>WikiText</w:t>
+            </w:r>
+            <w:proofErr w:type="spellEnd"/>
             <w:r>
               <w:rPr>
                 <w:rFonts w:asciiTheme="majorHAnsi" w:hAnsiTheme="majorHAnsi" w:cstheme="majorHAnsi"/>
@@ -965,6 +971,52 @@
                 <w:sz w:val="11"/>
                 <w:szCs w:val="11"/>
               </w:rPr>
+              <w:t>)</w:t>
+            </w:r>
+          </w:p>
+        </w:tc>
+        <w:tc>
+          <w:tcPr>
+            <w:tcW w:w="869" w:type="dxa"/>
+            <w:shd w:val="clear" w:color="auto" w:fill="E36C0A" w:themeFill="accent6" w:themeFillShade="BF"/>
+            <w:tcMar>
+              <w:top w:w="80" w:type="dxa"/>
+              <w:left w:w="60" w:type="dxa"/>
+              <w:bottom w:w="80" w:type="dxa"/>
+              <w:right w:w="60" w:type="dxa"/>
+            </w:tcMar>
+            <w:vAlign w:val="center"/>
+          </w:tcPr>
+          <w:p>
+            <w:pPr>
+              <w:jc w:val="center"/>
+              <w:rPr>
+                <w:rFonts w:asciiTheme="majorHAnsi" w:hAnsiTheme="majorHAnsi" w:cstheme="majorHAnsi"/>
+                <w:color w:val="000000" w:themeColor="text1"/>
+                <w:sz w:val="18"/>
+                <w:szCs w:val="18"/>
+              </w:rPr>
+            </w:pPr>
+            <w:r>
+              <w:rPr>
+                <w:rFonts w:asciiTheme="majorHAnsi" w:hAnsiTheme="majorHAnsi" w:cstheme="majorHAnsi"/>
+                <w:b/>
+                <w:bCs/>
+                <w:color w:val="000000" w:themeColor="text1"/>
+                <w:sz w:val="11"/>
+                <w:szCs w:val="11"/>
+              </w:rPr>
+              <w:t>MMLU</w:t>
+            </w:r>
+            <w:r>
+              <w:rPr>
+                <w:rFonts w:asciiTheme="majorHAnsi" w:hAnsiTheme="majorHAnsi" w:cstheme="majorHAnsi"/>
+                <w:b/>
+                <w:bCs/>
+                <w:color w:val="000000" w:themeColor="text1"/>
+                <w:sz w:val="11"/>
+                <w:szCs w:val="11"/>
+              </w:rPr>
               <w:br/>
               <w:t>(5-shot)</w:t>
             </w:r>
@@ -992,6 +1044,7 @@
                 <w:szCs w:val="18"/>
               </w:rPr>
             </w:pPr>
+            <w:proofErr w:type="spellStart"/>
             <w:r>
               <w:rPr>
                 <w:rFonts w:asciiTheme="majorHAnsi" w:hAnsiTheme="majorHAnsi" w:cstheme="majorHAnsi"/>
@@ -1003,6 +1056,7 @@
               </w:rPr>
               <w:t>IFEval</w:t>
             </w:r>
+            <w:proofErr w:type="spellEnd"/>
           </w:p>
         </w:tc>
         <w:tc>
@@ -1036,8 +1090,9 @@
                 <w:sz w:val="11"/>
                 <w:szCs w:val="11"/>
               </w:rPr>
-              <w:t>GSM8K CoT</w:t>
-            </w:r>
+              <w:t xml:space="preserve">GSM8K </w:t>
+            </w:r>
+            <w:proofErr w:type="spellStart"/>
             <w:r>
               <w:rPr>
                 <w:rFonts w:asciiTheme="majorHAnsi" w:hAnsiTheme="majorHAnsi" w:cstheme="majorHAnsi"/>
@@ -1047,6 +1102,18 @@
                 <w:sz w:val="11"/>
                 <w:szCs w:val="11"/>
               </w:rPr>
+              <w:t>CoT</w:t>
+            </w:r>
+            <w:proofErr w:type="spellEnd"/>
+            <w:r>
+              <w:rPr>
+                <w:rFonts w:asciiTheme="majorHAnsi" w:hAnsiTheme="majorHAnsi" w:cstheme="majorHAnsi"/>
+                <w:b/>
+                <w:bCs/>
+                <w:color w:val="000000" w:themeColor="text1"/>
+                <w:sz w:val="11"/>
+                <w:szCs w:val="11"/>
+              </w:rPr>
               <w:br/>
               <w:t>(8-shot)</w:t>
             </w:r>
@@ -1154,25 +1221,10 @@
                 <w:szCs w:val="11"/>
               </w:rPr>
               <w:br/>
-              <w:t>(WikiText)</w:t>
-            </w:r>
-          </w:p>
-        </w:tc>
-        <w:tc>
-          <w:tcPr>
-            <w:tcW w:w="869" w:type="dxa"/>
-            <w:shd w:val="clear" w:color="auto" w:fill="FFFF66"/>
-            <w:tcMar>
-              <w:top w:w="60" w:type="dxa"/>
-              <w:left w:w="80" w:type="dxa"/>
-              <w:bottom w:w="60" w:type="dxa"/>
-              <w:right w:w="80" w:type="dxa"/>
-            </w:tcMar>
-            <w:vAlign w:val="center"/>
-          </w:tcPr>
-          <w:p>
-            <w:pPr>
-              <w:jc w:val="center"/>
+              <w:t>(</w:t>
+            </w:r>
+            <w:proofErr w:type="spellStart"/>
+            <w:r>
               <w:rPr>
                 <w:rFonts w:asciiTheme="majorHAnsi" w:hAnsiTheme="majorHAnsi" w:cstheme="majorHAnsi"/>
                 <w:b/>
@@ -1181,7 +1233,9 @@
                 <w:sz w:val="11"/>
                 <w:szCs w:val="11"/>
               </w:rPr>
-            </w:pPr>
+              <w:t>WikiText</w:t>
+            </w:r>
+            <w:proofErr w:type="spellEnd"/>
             <w:r>
               <w:rPr>
                 <w:rFonts w:asciiTheme="majorHAnsi" w:hAnsiTheme="majorHAnsi" w:cstheme="majorHAnsi"/>
@@ -1191,20 +1245,25 @@
                 <w:sz w:val="11"/>
                 <w:szCs w:val="11"/>
               </w:rPr>
-              <w:t>MMLU</w:t>
-            </w:r>
-          </w:p>
+              <w:t>)</w:t>
+            </w:r>
+          </w:p>
+        </w:tc>
+        <w:tc>
+          <w:tcPr>
+            <w:tcW w:w="869" w:type="dxa"/>
+            <w:shd w:val="clear" w:color="auto" w:fill="FFFF66"/>
+            <w:tcMar>
+              <w:top w:w="60" w:type="dxa"/>
+              <w:left w:w="80" w:type="dxa"/>
+              <w:bottom w:w="60" w:type="dxa"/>
+              <w:right w:w="80" w:type="dxa"/>
+            </w:tcMar>
+            <w:vAlign w:val="center"/>
+          </w:tcPr>
           <w:p>
             <w:pPr>
               <w:jc w:val="center"/>
-              <w:rPr>
-                <w:rFonts w:asciiTheme="majorHAnsi" w:hAnsiTheme="majorHAnsi" w:cstheme="majorHAnsi"/>
-                <w:color w:val="000000" w:themeColor="text1"/>
-                <w:sz w:val="18"/>
-                <w:szCs w:val="18"/>
-              </w:rPr>
-            </w:pPr>
-            <w:r>
               <w:rPr>
                 <w:rFonts w:asciiTheme="majorHAnsi" w:hAnsiTheme="majorHAnsi" w:cstheme="majorHAnsi"/>
                 <w:b/>
@@ -1213,31 +1272,6 @@
                 <w:sz w:val="11"/>
                 <w:szCs w:val="11"/>
               </w:rPr>
-              <w:t>(5-shot)</w:t>
-            </w:r>
-          </w:p>
-        </w:tc>
-        <w:tc>
-          <w:tcPr>
-            <w:tcW w:w="869" w:type="dxa"/>
-            <w:shd w:val="clear" w:color="auto" w:fill="FFFF66"/>
-            <w:tcMar>
-              <w:top w:w="60" w:type="dxa"/>
-              <w:left w:w="80" w:type="dxa"/>
-              <w:bottom w:w="60" w:type="dxa"/>
-              <w:right w:w="80" w:type="dxa"/>
-            </w:tcMar>
-            <w:vAlign w:val="center"/>
-          </w:tcPr>
-          <w:p>
-            <w:pPr>
-              <w:jc w:val="center"/>
-              <w:rPr>
-                <w:rFonts w:asciiTheme="majorHAnsi" w:hAnsiTheme="majorHAnsi" w:cstheme="majorHAnsi"/>
-                <w:color w:val="000000" w:themeColor="text1"/>
-                <w:sz w:val="18"/>
-                <w:szCs w:val="18"/>
-              </w:rPr>
             </w:pPr>
             <w:r>
               <w:rPr>
@@ -1248,25 +1282,20 @@
                 <w:sz w:val="11"/>
                 <w:szCs w:val="11"/>
               </w:rPr>
-              <w:t>IFEval</w:t>
-            </w:r>
-          </w:p>
-        </w:tc>
-        <w:tc>
-          <w:tcPr>
-            <w:tcW w:w="869" w:type="dxa"/>
-            <w:shd w:val="clear" w:color="auto" w:fill="FFFF66"/>
-            <w:tcMar>
-              <w:top w:w="60" w:type="dxa"/>
-              <w:left w:w="80" w:type="dxa"/>
-              <w:bottom w:w="60" w:type="dxa"/>
-              <w:right w:w="80" w:type="dxa"/>
-            </w:tcMar>
-            <w:vAlign w:val="center"/>
-          </w:tcPr>
+              <w:t>MMLU</w:t>
+            </w:r>
+          </w:p>
           <w:p>
             <w:pPr>
               <w:jc w:val="center"/>
+              <w:rPr>
+                <w:rFonts w:asciiTheme="majorHAnsi" w:hAnsiTheme="majorHAnsi" w:cstheme="majorHAnsi"/>
+                <w:color w:val="000000" w:themeColor="text1"/>
+                <w:sz w:val="18"/>
+                <w:szCs w:val="18"/>
+              </w:rPr>
+            </w:pPr>
+            <w:r>
               <w:rPr>
                 <w:rFonts w:asciiTheme="majorHAnsi" w:hAnsiTheme="majorHAnsi" w:cstheme="majorHAnsi"/>
                 <w:b/>
@@ -1275,7 +1304,33 @@
                 <w:sz w:val="11"/>
                 <w:szCs w:val="11"/>
               </w:rPr>
-            </w:pPr>
+              <w:t>(5-shot)</w:t>
+            </w:r>
+          </w:p>
+        </w:tc>
+        <w:tc>
+          <w:tcPr>
+            <w:tcW w:w="869" w:type="dxa"/>
+            <w:shd w:val="clear" w:color="auto" w:fill="FFFF66"/>
+            <w:tcMar>
+              <w:top w:w="60" w:type="dxa"/>
+              <w:left w:w="80" w:type="dxa"/>
+              <w:bottom w:w="60" w:type="dxa"/>
+              <w:right w:w="80" w:type="dxa"/>
+            </w:tcMar>
+            <w:vAlign w:val="center"/>
+          </w:tcPr>
+          <w:p>
+            <w:pPr>
+              <w:jc w:val="center"/>
+              <w:rPr>
+                <w:rFonts w:asciiTheme="majorHAnsi" w:hAnsiTheme="majorHAnsi" w:cstheme="majorHAnsi"/>
+                <w:color w:val="000000" w:themeColor="text1"/>
+                <w:sz w:val="18"/>
+                <w:szCs w:val="18"/>
+              </w:rPr>
+            </w:pPr>
+            <w:proofErr w:type="spellStart"/>
             <w:r>
               <w:rPr>
                 <w:rFonts w:asciiTheme="majorHAnsi" w:hAnsiTheme="majorHAnsi" w:cstheme="majorHAnsi"/>
@@ -1285,20 +1340,26 @@
                 <w:sz w:val="11"/>
                 <w:szCs w:val="11"/>
               </w:rPr>
-              <w:t>GSM8K CoT</w:t>
-            </w:r>
-          </w:p>
+              <w:t>IFEval</w:t>
+            </w:r>
+            <w:proofErr w:type="spellEnd"/>
+          </w:p>
+        </w:tc>
+        <w:tc>
+          <w:tcPr>
+            <w:tcW w:w="869" w:type="dxa"/>
+            <w:shd w:val="clear" w:color="auto" w:fill="FFFF66"/>
+            <w:tcMar>
+              <w:top w:w="60" w:type="dxa"/>
+              <w:left w:w="80" w:type="dxa"/>
+              <w:bottom w:w="60" w:type="dxa"/>
+              <w:right w:w="80" w:type="dxa"/>
+            </w:tcMar>
+            <w:vAlign w:val="center"/>
+          </w:tcPr>
           <w:p>
             <w:pPr>
               <w:jc w:val="center"/>
-              <w:rPr>
-                <w:rFonts w:asciiTheme="majorHAnsi" w:hAnsiTheme="majorHAnsi" w:cstheme="majorHAnsi"/>
-                <w:color w:val="000000" w:themeColor="text1"/>
-                <w:sz w:val="18"/>
-                <w:szCs w:val="18"/>
-              </w:rPr>
-            </w:pPr>
-            <w:r>
               <w:rPr>
                 <w:rFonts w:asciiTheme="majorHAnsi" w:hAnsiTheme="majorHAnsi" w:cstheme="majorHAnsi"/>
                 <w:b/>
@@ -1307,25 +1368,8 @@
                 <w:sz w:val="11"/>
                 <w:szCs w:val="11"/>
               </w:rPr>
-              <w:t>(8-shot)</w:t>
-            </w:r>
-          </w:p>
-        </w:tc>
-        <w:tc>
-          <w:tcPr>
-            <w:tcW w:w="869" w:type="dxa"/>
-            <w:shd w:val="clear" w:color="auto" w:fill="FFFF66"/>
-            <w:tcMar>
-              <w:top w:w="60" w:type="dxa"/>
-              <w:left w:w="80" w:type="dxa"/>
-              <w:bottom w:w="60" w:type="dxa"/>
-              <w:right w:w="80" w:type="dxa"/>
-            </w:tcMar>
-            <w:vAlign w:val="center"/>
-          </w:tcPr>
-          <w:p>
-            <w:pPr>
-              <w:jc w:val="center"/>
+            </w:pPr>
+            <w:r>
               <w:rPr>
                 <w:rFonts w:asciiTheme="majorHAnsi" w:hAnsiTheme="majorHAnsi" w:cstheme="majorHAnsi"/>
                 <w:b/>
@@ -1334,7 +1378,9 @@
                 <w:sz w:val="11"/>
                 <w:szCs w:val="11"/>
               </w:rPr>
-            </w:pPr>
+              <w:t xml:space="preserve">GSM8K </w:t>
+            </w:r>
+            <w:proofErr w:type="spellStart"/>
             <w:r>
               <w:rPr>
                 <w:rFonts w:asciiTheme="majorHAnsi" w:hAnsiTheme="majorHAnsi" w:cstheme="majorHAnsi"/>
@@ -1344,8 +1390,9 @@
                 <w:sz w:val="11"/>
                 <w:szCs w:val="11"/>
               </w:rPr>
-              <w:t>ARC-C</w:t>
-            </w:r>
+              <w:t>CoT</w:t>
+            </w:r>
+            <w:proofErr w:type="spellEnd"/>
           </w:p>
           <w:p>
             <w:pPr>
@@ -1366,7 +1413,7 @@
                 <w:sz w:val="11"/>
                 <w:szCs w:val="11"/>
               </w:rPr>
-              <w:t>(0-shots)</w:t>
+              <w:t>(8-shot)</w:t>
             </w:r>
           </w:p>
         </w:tc>
@@ -1403,7 +1450,7 @@
                 <w:sz w:val="11"/>
                 <w:szCs w:val="11"/>
               </w:rPr>
-              <w:t>PPL ↓</w:t>
+              <w:t>ARC-C</w:t>
             </w:r>
           </w:p>
           <w:p>
@@ -1425,33 +1472,25 @@
                 <w:sz w:val="11"/>
                 <w:szCs w:val="11"/>
               </w:rPr>
-              <w:t>(WikiText)</w:t>
-            </w:r>
-          </w:p>
-        </w:tc>
-        <w:tc>
-          <w:tcPr>
-            <w:tcW w:w="869" w:type="dxa"/>
-            <w:shd w:val="clear" w:color="auto" w:fill="92D050"/>
-            <w:tcMar>
-              <w:top w:w="80" w:type="dxa"/>
-              <w:left w:w="60" w:type="dxa"/>
-              <w:bottom w:w="80" w:type="dxa"/>
-              <w:right w:w="60" w:type="dxa"/>
+              <w:t>(0-shots)</w:t>
+            </w:r>
+          </w:p>
+        </w:tc>
+        <w:tc>
+          <w:tcPr>
+            <w:tcW w:w="869" w:type="dxa"/>
+            <w:shd w:val="clear" w:color="auto" w:fill="FFFF66"/>
+            <w:tcMar>
+              <w:top w:w="60" w:type="dxa"/>
+              <w:left w:w="80" w:type="dxa"/>
+              <w:bottom w:w="60" w:type="dxa"/>
+              <w:right w:w="80" w:type="dxa"/>
             </w:tcMar>
             <w:vAlign w:val="center"/>
           </w:tcPr>
           <w:p>
             <w:pPr>
               <w:jc w:val="center"/>
-              <w:rPr>
-                <w:rFonts w:asciiTheme="majorHAnsi" w:hAnsiTheme="majorHAnsi" w:cstheme="majorHAnsi"/>
-                <w:color w:val="000000" w:themeColor="text1"/>
-                <w:sz w:val="18"/>
-                <w:szCs w:val="18"/>
-              </w:rPr>
-            </w:pPr>
-            <w:r>
               <w:rPr>
                 <w:rFonts w:asciiTheme="majorHAnsi" w:hAnsiTheme="majorHAnsi" w:cstheme="majorHAnsi"/>
                 <w:b/>
@@ -1460,8 +1499,7 @@
                 <w:sz w:val="11"/>
                 <w:szCs w:val="11"/>
               </w:rPr>
-              <w:t>MMLU</w:t>
-            </w:r>
+            </w:pPr>
             <w:r>
               <w:rPr>
                 <w:rFonts w:asciiTheme="majorHAnsi" w:hAnsiTheme="majorHAnsi" w:cstheme="majorHAnsi"/>
@@ -1471,6 +1509,98 @@
                 <w:sz w:val="11"/>
                 <w:szCs w:val="11"/>
               </w:rPr>
+              <w:t>PPL ↓</w:t>
+            </w:r>
+          </w:p>
+          <w:p>
+            <w:pPr>
+              <w:jc w:val="center"/>
+              <w:rPr>
+                <w:rFonts w:asciiTheme="majorHAnsi" w:hAnsiTheme="majorHAnsi" w:cstheme="majorHAnsi"/>
+                <w:color w:val="000000" w:themeColor="text1"/>
+                <w:sz w:val="18"/>
+                <w:szCs w:val="18"/>
+              </w:rPr>
+            </w:pPr>
+            <w:r>
+              <w:rPr>
+                <w:rFonts w:asciiTheme="majorHAnsi" w:hAnsiTheme="majorHAnsi" w:cstheme="majorHAnsi"/>
+                <w:b/>
+                <w:bCs/>
+                <w:color w:val="000000" w:themeColor="text1"/>
+                <w:sz w:val="11"/>
+                <w:szCs w:val="11"/>
+              </w:rPr>
+              <w:t>(</w:t>
+            </w:r>
+            <w:proofErr w:type="spellStart"/>
+            <w:r>
+              <w:rPr>
+                <w:rFonts w:asciiTheme="majorHAnsi" w:hAnsiTheme="majorHAnsi" w:cstheme="majorHAnsi"/>
+                <w:b/>
+                <w:bCs/>
+                <w:color w:val="000000" w:themeColor="text1"/>
+                <w:sz w:val="11"/>
+                <w:szCs w:val="11"/>
+              </w:rPr>
+              <w:t>WikiText</w:t>
+            </w:r>
+            <w:proofErr w:type="spellEnd"/>
+            <w:r>
+              <w:rPr>
+                <w:rFonts w:asciiTheme="majorHAnsi" w:hAnsiTheme="majorHAnsi" w:cstheme="majorHAnsi"/>
+                <w:b/>
+                <w:bCs/>
+                <w:color w:val="000000" w:themeColor="text1"/>
+                <w:sz w:val="11"/>
+                <w:szCs w:val="11"/>
+              </w:rPr>
+              <w:t>)</w:t>
+            </w:r>
+          </w:p>
+        </w:tc>
+        <w:tc>
+          <w:tcPr>
+            <w:tcW w:w="869" w:type="dxa"/>
+            <w:shd w:val="clear" w:color="auto" w:fill="92D050"/>
+            <w:tcMar>
+              <w:top w:w="80" w:type="dxa"/>
+              <w:left w:w="60" w:type="dxa"/>
+              <w:bottom w:w="80" w:type="dxa"/>
+              <w:right w:w="60" w:type="dxa"/>
+            </w:tcMar>
+            <w:vAlign w:val="center"/>
+          </w:tcPr>
+          <w:p>
+            <w:pPr>
+              <w:jc w:val="center"/>
+              <w:rPr>
+                <w:rFonts w:asciiTheme="majorHAnsi" w:hAnsiTheme="majorHAnsi" w:cstheme="majorHAnsi"/>
+                <w:color w:val="000000" w:themeColor="text1"/>
+                <w:sz w:val="18"/>
+                <w:szCs w:val="18"/>
+              </w:rPr>
+            </w:pPr>
+            <w:r>
+              <w:rPr>
+                <w:rFonts w:asciiTheme="majorHAnsi" w:hAnsiTheme="majorHAnsi" w:cstheme="majorHAnsi"/>
+                <w:b/>
+                <w:bCs/>
+                <w:color w:val="000000" w:themeColor="text1"/>
+                <w:sz w:val="11"/>
+                <w:szCs w:val="11"/>
+              </w:rPr>
+              <w:t>MMLU</w:t>
+            </w:r>
+            <w:r>
+              <w:rPr>
+                <w:rFonts w:asciiTheme="majorHAnsi" w:hAnsiTheme="majorHAnsi" w:cstheme="majorHAnsi"/>
+                <w:b/>
+                <w:bCs/>
+                <w:color w:val="000000" w:themeColor="text1"/>
+                <w:sz w:val="11"/>
+                <w:szCs w:val="11"/>
+              </w:rPr>
               <w:br/>
               <w:t>(5-shot)</w:t>
             </w:r>
@@ -1498,6 +1628,7 @@
                 <w:szCs w:val="18"/>
               </w:rPr>
             </w:pPr>
+            <w:proofErr w:type="spellStart"/>
             <w:r>
               <w:rPr>
                 <w:rFonts w:asciiTheme="majorHAnsi" w:hAnsiTheme="majorHAnsi" w:cstheme="majorHAnsi"/>
@@ -1509,6 +1640,7 @@
               </w:rPr>
               <w:t>IFEval</w:t>
             </w:r>
+            <w:proofErr w:type="spellEnd"/>
           </w:p>
         </w:tc>
         <w:tc>
@@ -1542,8 +1674,9 @@
                 <w:sz w:val="11"/>
                 <w:szCs w:val="11"/>
               </w:rPr>
-              <w:t>GSM8K CoT</w:t>
-            </w:r>
+              <w:t xml:space="preserve">GSM8K </w:t>
+            </w:r>
+            <w:proofErr w:type="spellStart"/>
             <w:r>
               <w:rPr>
                 <w:rFonts w:asciiTheme="majorHAnsi" w:hAnsiTheme="majorHAnsi" w:cstheme="majorHAnsi"/>
@@ -1553,6 +1686,18 @@
                 <w:sz w:val="11"/>
                 <w:szCs w:val="11"/>
               </w:rPr>
+              <w:t>CoT</w:t>
+            </w:r>
+            <w:proofErr w:type="spellEnd"/>
+            <w:r>
+              <w:rPr>
+                <w:rFonts w:asciiTheme="majorHAnsi" w:hAnsiTheme="majorHAnsi" w:cstheme="majorHAnsi"/>
+                <w:b/>
+                <w:bCs/>
+                <w:color w:val="000000" w:themeColor="text1"/>
+                <w:sz w:val="11"/>
+                <w:szCs w:val="11"/>
+              </w:rPr>
               <w:br/>
               <w:t>(8-shot)</w:t>
             </w:r>
@@ -1648,32 +1793,9 @@
                 <w:szCs w:val="11"/>
               </w:rPr>
               <w:br/>
-              <w:t>(WikiText)</w:t>
-            </w:r>
-          </w:p>
-        </w:tc>
-        <w:tc>
-          <w:tcPr>
-            <w:tcW w:w="869" w:type="dxa"/>
-            <w:shd w:val="clear" w:color="auto" w:fill="984806" w:themeFill="accent6" w:themeFillShade="80"/>
-            <w:tcMar>
-              <w:top w:w="80" w:type="dxa"/>
-              <w:left w:w="60" w:type="dxa"/>
-              <w:bottom w:w="80" w:type="dxa"/>
-              <w:right w:w="60" w:type="dxa"/>
-            </w:tcMar>
-            <w:vAlign w:val="center"/>
-          </w:tcPr>
-          <w:p>
-            <w:pPr>
-              <w:jc w:val="center"/>
-              <w:rPr>
-                <w:rFonts w:asciiTheme="majorHAnsi" w:hAnsiTheme="majorHAnsi" w:cstheme="majorHAnsi"/>
-                <w:color w:val="000000" w:themeColor="text1"/>
-                <w:sz w:val="18"/>
-                <w:szCs w:val="18"/>
-              </w:rPr>
-            </w:pPr>
+              <w:t>(</w:t>
+            </w:r>
+            <w:proofErr w:type="spellStart"/>
             <w:r>
               <w:rPr>
                 <w:rFonts w:asciiTheme="majorHAnsi" w:hAnsiTheme="majorHAnsi" w:cstheme="majorHAnsi"/>
@@ -1683,8 +1805,9 @@
                 <w:sz w:val="11"/>
                 <w:szCs w:val="11"/>
               </w:rPr>
-              <w:t>MMLU</w:t>
-            </w:r>
+              <w:t>WikiText</w:t>
+            </w:r>
+            <w:proofErr w:type="spellEnd"/>
             <w:r>
               <w:rPr>
                 <w:rFonts w:asciiTheme="majorHAnsi" w:hAnsiTheme="majorHAnsi" w:cstheme="majorHAnsi"/>
@@ -1694,6 +1817,52 @@
                 <w:sz w:val="11"/>
                 <w:szCs w:val="11"/>
               </w:rPr>
+              <w:t>)</w:t>
+            </w:r>
+          </w:p>
+        </w:tc>
+        <w:tc>
+          <w:tcPr>
+            <w:tcW w:w="869" w:type="dxa"/>
+            <w:shd w:val="clear" w:color="auto" w:fill="984806" w:themeFill="accent6" w:themeFillShade="80"/>
+            <w:tcMar>
+              <w:top w:w="80" w:type="dxa"/>
+              <w:left w:w="60" w:type="dxa"/>
+              <w:bottom w:w="80" w:type="dxa"/>
+              <w:right w:w="60" w:type="dxa"/>
+            </w:tcMar>
+            <w:vAlign w:val="center"/>
+          </w:tcPr>
+          <w:p>
+            <w:pPr>
+              <w:jc w:val="center"/>
+              <w:rPr>
+                <w:rFonts w:asciiTheme="majorHAnsi" w:hAnsiTheme="majorHAnsi" w:cstheme="majorHAnsi"/>
+                <w:color w:val="000000" w:themeColor="text1"/>
+                <w:sz w:val="18"/>
+                <w:szCs w:val="18"/>
+              </w:rPr>
+            </w:pPr>
+            <w:r>
+              <w:rPr>
+                <w:rFonts w:asciiTheme="majorHAnsi" w:hAnsiTheme="majorHAnsi" w:cstheme="majorHAnsi"/>
+                <w:b/>
+                <w:bCs/>
+                <w:color w:val="000000" w:themeColor="text1"/>
+                <w:sz w:val="11"/>
+                <w:szCs w:val="11"/>
+              </w:rPr>
+              <w:t>MMLU</w:t>
+            </w:r>
+            <w:r>
+              <w:rPr>
+                <w:rFonts w:asciiTheme="majorHAnsi" w:hAnsiTheme="majorHAnsi" w:cstheme="majorHAnsi"/>
+                <w:b/>
+                <w:bCs/>
+                <w:color w:val="000000" w:themeColor="text1"/>
+                <w:sz w:val="11"/>
+                <w:szCs w:val="11"/>
+              </w:rPr>
               <w:br/>
               <w:t>(5-shot)</w:t>
             </w:r>
@@ -1721,6 +1890,7 @@
                 <w:szCs w:val="18"/>
               </w:rPr>
             </w:pPr>
+            <w:proofErr w:type="spellStart"/>
             <w:r>
               <w:rPr>
                 <w:rFonts w:asciiTheme="majorHAnsi" w:hAnsiTheme="majorHAnsi" w:cstheme="majorHAnsi"/>
@@ -1732,6 +1902,7 @@
               </w:rPr>
               <w:t>IFEval</w:t>
             </w:r>
+            <w:proofErr w:type="spellEnd"/>
           </w:p>
         </w:tc>
         <w:tc>
@@ -1765,8 +1936,9 @@
                 <w:sz w:val="11"/>
                 <w:szCs w:val="11"/>
               </w:rPr>
-              <w:t>GSM8K CoT</w:t>
-            </w:r>
+              <w:t xml:space="preserve">GSM8K </w:t>
+            </w:r>
+            <w:proofErr w:type="spellStart"/>
             <w:r>
               <w:rPr>
                 <w:rFonts w:asciiTheme="majorHAnsi" w:hAnsiTheme="majorHAnsi" w:cstheme="majorHAnsi"/>
@@ -1776,6 +1948,18 @@
                 <w:sz w:val="11"/>
                 <w:szCs w:val="11"/>
               </w:rPr>
+              <w:t>CoT</w:t>
+            </w:r>
+            <w:proofErr w:type="spellEnd"/>
+            <w:r>
+              <w:rPr>
+                <w:rFonts w:asciiTheme="majorHAnsi" w:hAnsiTheme="majorHAnsi" w:cstheme="majorHAnsi"/>
+                <w:b/>
+                <w:bCs/>
+                <w:color w:val="000000" w:themeColor="text1"/>
+                <w:sz w:val="11"/>
+                <w:szCs w:val="11"/>
+              </w:rPr>
               <w:br/>
               <w:t>(8-shot)</w:t>
             </w:r>
@@ -1871,7 +2055,31 @@
                 <w:szCs w:val="11"/>
               </w:rPr>
               <w:br/>
-              <w:t>(WikiText)</w:t>
+              <w:t>(</w:t>
+            </w:r>
+            <w:proofErr w:type="spellStart"/>
+            <w:r>
+              <w:rPr>
+                <w:rFonts w:asciiTheme="majorHAnsi" w:hAnsiTheme="majorHAnsi" w:cstheme="majorHAnsi"/>
+                <w:b/>
+                <w:bCs/>
+                <w:color w:val="000000" w:themeColor="text1"/>
+                <w:sz w:val="11"/>
+                <w:szCs w:val="11"/>
+              </w:rPr>
+              <w:t>WikiText</w:t>
+            </w:r>
+            <w:proofErr w:type="spellEnd"/>
+            <w:r>
+              <w:rPr>
+                <w:rFonts w:asciiTheme="majorHAnsi" w:hAnsiTheme="majorHAnsi" w:cstheme="majorHAnsi"/>
+                <w:b/>
+                <w:bCs/>
+                <w:color w:val="000000" w:themeColor="text1"/>
+                <w:sz w:val="11"/>
+                <w:szCs w:val="11"/>
+              </w:rPr>
+              <w:t>)</w:t>
             </w:r>
           </w:p>
         </w:tc>
@@ -5327,14 +5535,25 @@
                 <w:szCs w:val="18"/>
               </w:rPr>
             </w:pPr>
-            <w:r>
-              <w:rPr>
-                <w:rFonts w:asciiTheme="majorHAnsi" w:hAnsiTheme="majorHAnsi" w:cstheme="majorHAnsi"/>
-                <w:color w:val="000000" w:themeColor="text1"/>
-                <w:sz w:val="12"/>
-                <w:szCs w:val="12"/>
-              </w:rPr>
-              <w:t>SparseGPT (unstructured)</w:t>
+            <w:proofErr w:type="spellStart"/>
+            <w:r>
+              <w:rPr>
+                <w:rFonts w:asciiTheme="majorHAnsi" w:hAnsiTheme="majorHAnsi" w:cstheme="majorHAnsi"/>
+                <w:color w:val="000000" w:themeColor="text1"/>
+                <w:sz w:val="12"/>
+                <w:szCs w:val="12"/>
+              </w:rPr>
+              <w:t>SparseGPT</w:t>
+            </w:r>
+            <w:proofErr w:type="spellEnd"/>
+            <w:r>
+              <w:rPr>
+                <w:rFonts w:asciiTheme="majorHAnsi" w:hAnsiTheme="majorHAnsi" w:cstheme="majorHAnsi"/>
+                <w:color w:val="000000" w:themeColor="text1"/>
+                <w:sz w:val="12"/>
+                <w:szCs w:val="12"/>
+              </w:rPr>
+              <w:t xml:space="preserve"> (unstructured)</w:t>
             </w:r>
           </w:p>
         </w:tc>
@@ -9323,18 +9542,18 @@
               <w:rPr>
                 <w:rFonts w:asciiTheme="majorHAnsi" w:hAnsiTheme="majorHAnsi" w:cstheme="majorHAnsi"/>
                 <w:color w:val="000000" w:themeColor="text1"/>
-                <w:sz w:val="18"/>
-                <w:szCs w:val="18"/>
-              </w:rPr>
-            </w:pPr>
-            <w:r>
-              <w:rPr>
-                <w:rFonts w:asciiTheme="majorHAnsi" w:hAnsiTheme="majorHAnsi" w:cstheme="majorHAnsi"/>
-                <w:color w:val="000000" w:themeColor="text1"/>
-                <w:sz w:val="12"/>
-                <w:szCs w:val="12"/>
-              </w:rPr>
-              <w:t>N/A</w:t>
+                <w:sz w:val="16"/>
+                <w:szCs w:val="16"/>
+              </w:rPr>
+            </w:pPr>
+            <w:r>
+              <w:rPr>
+                <w:rFonts w:asciiTheme="majorHAnsi" w:hAnsiTheme="majorHAnsi" w:cstheme="majorHAnsi"/>
+                <w:color w:val="000000" w:themeColor="text1"/>
+                <w:sz w:val="16"/>
+                <w:szCs w:val="16"/>
+              </w:rPr>
+              <w:t>83.63</w:t>
             </w:r>
           </w:p>
         </w:tc>
@@ -9385,18 +9604,18 @@
               <w:rPr>
                 <w:rFonts w:asciiTheme="majorHAnsi" w:hAnsiTheme="majorHAnsi" w:cstheme="majorHAnsi"/>
                 <w:color w:val="000000" w:themeColor="text1"/>
-                <w:sz w:val="18"/>
-                <w:szCs w:val="18"/>
-              </w:rPr>
-            </w:pPr>
-            <w:r>
-              <w:rPr>
-                <w:rFonts w:asciiTheme="majorHAnsi" w:hAnsiTheme="majorHAnsi" w:cstheme="majorHAnsi"/>
-                <w:color w:val="000000" w:themeColor="text1"/>
-                <w:sz w:val="12"/>
-                <w:szCs w:val="12"/>
-              </w:rPr>
-              <w:t>N/A</w:t>
+                <w:sz w:val="16"/>
+                <w:szCs w:val="16"/>
+              </w:rPr>
+            </w:pPr>
+            <w:r>
+              <w:rPr>
+                <w:rFonts w:asciiTheme="majorHAnsi" w:hAnsiTheme="majorHAnsi" w:cstheme="majorHAnsi"/>
+                <w:color w:val="000000" w:themeColor="text1"/>
+                <w:sz w:val="16"/>
+                <w:szCs w:val="16"/>
+              </w:rPr>
+              <w:t>41.98</w:t>
             </w:r>
           </w:p>
         </w:tc>
@@ -9416,18 +9635,18 @@
               <w:rPr>
                 <w:rFonts w:asciiTheme="majorHAnsi" w:hAnsiTheme="majorHAnsi" w:cstheme="majorHAnsi"/>
                 <w:color w:val="000000" w:themeColor="text1"/>
-                <w:sz w:val="18"/>
-                <w:szCs w:val="18"/>
-              </w:rPr>
-            </w:pPr>
-            <w:r>
-              <w:rPr>
-                <w:rFonts w:asciiTheme="majorHAnsi" w:hAnsiTheme="majorHAnsi" w:cstheme="majorHAnsi"/>
-                <w:color w:val="000000" w:themeColor="text1"/>
-                <w:sz w:val="12"/>
-                <w:szCs w:val="12"/>
-              </w:rPr>
-              <w:t>N/A</w:t>
+                <w:sz w:val="16"/>
+                <w:szCs w:val="16"/>
+              </w:rPr>
+            </w:pPr>
+            <w:r>
+              <w:rPr>
+                <w:rFonts w:asciiTheme="majorHAnsi" w:hAnsiTheme="majorHAnsi" w:cstheme="majorHAnsi"/>
+                <w:color w:val="000000" w:themeColor="text1"/>
+                <w:sz w:val="16"/>
+                <w:szCs w:val="16"/>
+              </w:rPr>
+              <w:t>14.03</w:t>
             </w:r>
           </w:p>
         </w:tc>
@@ -14776,14 +14995,25 @@
                 <w:szCs w:val="18"/>
               </w:rPr>
             </w:pPr>
-            <w:r>
-              <w:rPr>
-                <w:rFonts w:asciiTheme="majorHAnsi" w:hAnsiTheme="majorHAnsi" w:cstheme="majorHAnsi"/>
-                <w:color w:val="000000" w:themeColor="text1"/>
-                <w:sz w:val="12"/>
-                <w:szCs w:val="12"/>
-              </w:rPr>
-              <w:t>SparseGPT + AWQ</w:t>
+            <w:proofErr w:type="spellStart"/>
+            <w:r>
+              <w:rPr>
+                <w:rFonts w:asciiTheme="majorHAnsi" w:hAnsiTheme="majorHAnsi" w:cstheme="majorHAnsi"/>
+                <w:color w:val="000000" w:themeColor="text1"/>
+                <w:sz w:val="12"/>
+                <w:szCs w:val="12"/>
+              </w:rPr>
+              <w:t>SparseGPT</w:t>
+            </w:r>
+            <w:proofErr w:type="spellEnd"/>
+            <w:r>
+              <w:rPr>
+                <w:rFonts w:asciiTheme="majorHAnsi" w:hAnsiTheme="majorHAnsi" w:cstheme="majorHAnsi"/>
+                <w:color w:val="000000" w:themeColor="text1"/>
+                <w:sz w:val="12"/>
+                <w:szCs w:val="12"/>
+              </w:rPr>
+              <w:t xml:space="preserve"> + AWQ</w:t>
             </w:r>
           </w:p>
         </w:tc>
@@ -17341,14 +17571,25 @@
                 <w:szCs w:val="18"/>
               </w:rPr>
             </w:pPr>
-            <w:r>
-              <w:rPr>
-                <w:rFonts w:asciiTheme="majorHAnsi" w:hAnsiTheme="majorHAnsi" w:cstheme="majorHAnsi"/>
-                <w:color w:val="000000" w:themeColor="text1"/>
-                <w:sz w:val="12"/>
-                <w:szCs w:val="12"/>
-              </w:rPr>
-              <w:t>SparseGPT + GPTQ</w:t>
+            <w:proofErr w:type="spellStart"/>
+            <w:r>
+              <w:rPr>
+                <w:rFonts w:asciiTheme="majorHAnsi" w:hAnsiTheme="majorHAnsi" w:cstheme="majorHAnsi"/>
+                <w:color w:val="000000" w:themeColor="text1"/>
+                <w:sz w:val="12"/>
+                <w:szCs w:val="12"/>
+              </w:rPr>
+              <w:t>SparseGPT</w:t>
+            </w:r>
+            <w:proofErr w:type="spellEnd"/>
+            <w:r>
+              <w:rPr>
+                <w:rFonts w:asciiTheme="majorHAnsi" w:hAnsiTheme="majorHAnsi" w:cstheme="majorHAnsi"/>
+                <w:color w:val="000000" w:themeColor="text1"/>
+                <w:sz w:val="12"/>
+                <w:szCs w:val="12"/>
+              </w:rPr>
+              <w:t xml:space="preserve"> + GPTQ</w:t>
             </w:r>
           </w:p>
         </w:tc>

</xml_diff>

<commit_message>
Added new results in inference_comparison
</commit_message>
<xml_diff>
--- a/Evaluations/BenchmarkEvaluations/BenchmarkComparison.docx
+++ b/Evaluations/BenchmarkEvaluations/BenchmarkComparison.docx
@@ -9542,16 +9542,16 @@
               <w:rPr>
                 <w:rFonts w:asciiTheme="majorHAnsi" w:hAnsiTheme="majorHAnsi" w:cstheme="majorHAnsi"/>
                 <w:color w:val="000000" w:themeColor="text1"/>
-                <w:sz w:val="16"/>
-                <w:szCs w:val="16"/>
-              </w:rPr>
-            </w:pPr>
-            <w:r>
-              <w:rPr>
-                <w:rFonts w:asciiTheme="majorHAnsi" w:hAnsiTheme="majorHAnsi" w:cstheme="majorHAnsi"/>
-                <w:color w:val="000000" w:themeColor="text1"/>
-                <w:sz w:val="16"/>
-                <w:szCs w:val="16"/>
+                <w:sz w:val="18"/>
+                <w:szCs w:val="18"/>
+              </w:rPr>
+            </w:pPr>
+            <w:r>
+              <w:rPr>
+                <w:rFonts w:asciiTheme="majorHAnsi" w:hAnsiTheme="majorHAnsi" w:cstheme="majorHAnsi"/>
+                <w:color w:val="000000" w:themeColor="text1"/>
+                <w:sz w:val="18"/>
+                <w:szCs w:val="18"/>
               </w:rPr>
               <w:t>83.63</w:t>
             </w:r>
@@ -9604,16 +9604,16 @@
               <w:rPr>
                 <w:rFonts w:asciiTheme="majorHAnsi" w:hAnsiTheme="majorHAnsi" w:cstheme="majorHAnsi"/>
                 <w:color w:val="000000" w:themeColor="text1"/>
-                <w:sz w:val="16"/>
-                <w:szCs w:val="16"/>
-              </w:rPr>
-            </w:pPr>
-            <w:r>
-              <w:rPr>
-                <w:rFonts w:asciiTheme="majorHAnsi" w:hAnsiTheme="majorHAnsi" w:cstheme="majorHAnsi"/>
-                <w:color w:val="000000" w:themeColor="text1"/>
-                <w:sz w:val="16"/>
-                <w:szCs w:val="16"/>
+                <w:sz w:val="18"/>
+                <w:szCs w:val="18"/>
+              </w:rPr>
+            </w:pPr>
+            <w:r>
+              <w:rPr>
+                <w:rFonts w:asciiTheme="majorHAnsi" w:hAnsiTheme="majorHAnsi" w:cstheme="majorHAnsi"/>
+                <w:color w:val="000000" w:themeColor="text1"/>
+                <w:sz w:val="18"/>
+                <w:szCs w:val="18"/>
               </w:rPr>
               <w:t>41.98</w:t>
             </w:r>
@@ -9635,16 +9635,16 @@
               <w:rPr>
                 <w:rFonts w:asciiTheme="majorHAnsi" w:hAnsiTheme="majorHAnsi" w:cstheme="majorHAnsi"/>
                 <w:color w:val="000000" w:themeColor="text1"/>
-                <w:sz w:val="16"/>
-                <w:szCs w:val="16"/>
-              </w:rPr>
-            </w:pPr>
-            <w:r>
-              <w:rPr>
-                <w:rFonts w:asciiTheme="majorHAnsi" w:hAnsiTheme="majorHAnsi" w:cstheme="majorHAnsi"/>
-                <w:color w:val="000000" w:themeColor="text1"/>
-                <w:sz w:val="16"/>
-                <w:szCs w:val="16"/>
+                <w:sz w:val="18"/>
+                <w:szCs w:val="18"/>
+              </w:rPr>
+            </w:pPr>
+            <w:r>
+              <w:rPr>
+                <w:rFonts w:asciiTheme="majorHAnsi" w:hAnsiTheme="majorHAnsi" w:cstheme="majorHAnsi"/>
+                <w:color w:val="000000" w:themeColor="text1"/>
+                <w:sz w:val="18"/>
+                <w:szCs w:val="18"/>
               </w:rPr>
               <w:t>14.03</w:t>
             </w:r>

</xml_diff>

<commit_message>
Added numbers in the comparison table
</commit_message>
<xml_diff>
--- a/Evaluations/BenchmarkEvaluations/BenchmarkComparison.docx
+++ b/Evaluations/BenchmarkEvaluations/BenchmarkComparison.docx
@@ -5413,32 +5413,32 @@
         <w:tc>
           <w:tcPr>
             <w:tcW w:w="869" w:type="dxa"/>
-            <w:shd w:val="clear" w:color="auto" w:fill="FF0000"/>
-            <w:tcMar>
-              <w:top w:w="80" w:type="dxa"/>
-              <w:left w:w="80" w:type="dxa"/>
-              <w:bottom w:w="80" w:type="dxa"/>
-              <w:right w:w="80" w:type="dxa"/>
-            </w:tcMar>
-          </w:tcPr>
-          <w:p>
-            <w:pPr>
-              <w:jc w:val="center"/>
-              <w:rPr>
-                <w:rFonts w:asciiTheme="minorBidi" w:hAnsiTheme="minorBidi" w:cstheme="minorBidi"/>
-                <w:color w:val="FFFFFF" w:themeColor="background1"/>
-                <w:sz w:val="12"/>
-                <w:szCs w:val="12"/>
-              </w:rPr>
-            </w:pPr>
-            <w:r>
-              <w:rPr>
-                <w:rFonts w:asciiTheme="minorBidi" w:hAnsiTheme="minorBidi" w:cstheme="minorBidi"/>
-                <w:color w:val="FFFFFF" w:themeColor="background1"/>
-                <w:sz w:val="12"/>
-                <w:szCs w:val="12"/>
-              </w:rPr>
-              <w:t>N/A</w:t>
+            <w:shd w:val="clear" w:color="auto" w:fill="403152" w:themeFill="accent4" w:themeFillShade="80"/>
+            <w:tcMar>
+              <w:top w:w="80" w:type="dxa"/>
+              <w:left w:w="80" w:type="dxa"/>
+              <w:bottom w:w="80" w:type="dxa"/>
+              <w:right w:w="80" w:type="dxa"/>
+            </w:tcMar>
+          </w:tcPr>
+          <w:p>
+            <w:pPr>
+              <w:jc w:val="center"/>
+              <w:rPr>
+                <w:rFonts w:asciiTheme="minorBidi" w:hAnsiTheme="minorBidi" w:cstheme="minorBidi"/>
+                <w:color w:val="FFFFFF" w:themeColor="background1"/>
+                <w:sz w:val="12"/>
+                <w:szCs w:val="12"/>
+              </w:rPr>
+            </w:pPr>
+            <w:r>
+              <w:rPr>
+                <w:rFonts w:asciiTheme="minorBidi" w:hAnsiTheme="minorBidi" w:cstheme="minorBidi"/>
+                <w:color w:val="FFFFFF" w:themeColor="background1"/>
+                <w:sz w:val="12"/>
+                <w:szCs w:val="12"/>
+              </w:rPr>
+              <w:t>42.84</w:t>
             </w:r>
           </w:p>
         </w:tc>
@@ -9575,32 +9575,32 @@
         <w:tc>
           <w:tcPr>
             <w:tcW w:w="869" w:type="dxa"/>
-            <w:shd w:val="clear" w:color="auto" w:fill="FF0000"/>
-            <w:tcMar>
-              <w:top w:w="80" w:type="dxa"/>
-              <w:left w:w="80" w:type="dxa"/>
-              <w:bottom w:w="80" w:type="dxa"/>
-              <w:right w:w="80" w:type="dxa"/>
-            </w:tcMar>
-          </w:tcPr>
-          <w:p>
-            <w:pPr>
-              <w:jc w:val="center"/>
-              <w:rPr>
-                <w:rFonts w:asciiTheme="minorBidi" w:hAnsiTheme="minorBidi" w:cstheme="minorBidi"/>
-                <w:color w:val="984806" w:themeColor="accent6" w:themeShade="80"/>
-                <w:sz w:val="12"/>
-                <w:szCs w:val="12"/>
-              </w:rPr>
-            </w:pPr>
-            <w:r>
-              <w:rPr>
-                <w:rFonts w:asciiTheme="minorBidi" w:hAnsiTheme="minorBidi" w:cstheme="minorBidi"/>
-                <w:color w:val="984806" w:themeColor="accent6" w:themeShade="80"/>
-                <w:sz w:val="12"/>
-                <w:szCs w:val="12"/>
-              </w:rPr>
-              <w:t>0.00</w:t>
+            <w:shd w:val="clear" w:color="auto" w:fill="FABF8F" w:themeFill="accent6" w:themeFillTint="99"/>
+            <w:tcMar>
+              <w:top w:w="80" w:type="dxa"/>
+              <w:left w:w="80" w:type="dxa"/>
+              <w:bottom w:w="80" w:type="dxa"/>
+              <w:right w:w="80" w:type="dxa"/>
+            </w:tcMar>
+          </w:tcPr>
+          <w:p>
+            <w:pPr>
+              <w:jc w:val="center"/>
+              <w:rPr>
+                <w:rFonts w:asciiTheme="minorBidi" w:hAnsiTheme="minorBidi" w:cstheme="minorBidi"/>
+                <w:color w:val="984806" w:themeColor="accent6" w:themeShade="80"/>
+                <w:sz w:val="12"/>
+                <w:szCs w:val="12"/>
+              </w:rPr>
+            </w:pPr>
+            <w:r>
+              <w:rPr>
+                <w:rFonts w:asciiTheme="minorBidi" w:hAnsiTheme="minorBidi" w:cstheme="minorBidi"/>
+                <w:color w:val="984806" w:themeColor="accent6" w:themeShade="80"/>
+                <w:sz w:val="12"/>
+                <w:szCs w:val="12"/>
+              </w:rPr>
+              <w:t>1.52</w:t>
             </w:r>
           </w:p>
         </w:tc>

</xml_diff>

<commit_message>
Added New results for wikitext and filled the comparison table
</commit_message>
<xml_diff>
--- a/Evaluations/BenchmarkEvaluations/BenchmarkComparison.docx
+++ b/Evaluations/BenchmarkEvaluations/BenchmarkComparison.docx
@@ -1695,7 +1695,7 @@
         </w:tc>
         <w:tc>
           <w:tcPr>
-            <w:tcW w:w="220" w:type="pct"/>
+            <w:tcW w:w="219" w:type="pct"/>
             <w:shd w:val="clear" w:color="auto" w:fill="C6D9F1" w:themeFill="text2" w:themeFillTint="33"/>
             <w:tcMar>
               <w:top w:w="80" w:type="dxa"/>
@@ -2465,7 +2465,7 @@
         </w:tc>
         <w:tc>
           <w:tcPr>
-            <w:tcW w:w="220" w:type="pct"/>
+            <w:tcW w:w="219" w:type="pct"/>
             <w:shd w:val="clear" w:color="auto" w:fill="C6D9F1" w:themeFill="text2" w:themeFillTint="33"/>
             <w:tcMar>
               <w:top w:w="80" w:type="dxa"/>
@@ -3217,8 +3217,8 @@
         </w:tc>
         <w:tc>
           <w:tcPr>
-            <w:tcW w:w="220" w:type="pct"/>
-            <w:shd w:val="clear" w:color="auto" w:fill="B8CCE4" w:themeFill="accent1" w:themeFillTint="66"/>
+            <w:tcW w:w="219" w:type="pct"/>
+            <w:shd w:val="clear" w:color="auto" w:fill="C6D9F1" w:themeFill="text2" w:themeFillTint="33"/>
             <w:tcMar>
               <w:top w:w="80" w:type="dxa"/>
               <w:left w:w="80" w:type="dxa"/>
@@ -3932,7 +3932,7 @@
         </w:tc>
         <w:tc>
           <w:tcPr>
-            <w:tcW w:w="220" w:type="pct"/>
+            <w:tcW w:w="219" w:type="pct"/>
             <w:shd w:val="clear" w:color="auto" w:fill="C6D9F1" w:themeFill="text2" w:themeFillTint="33"/>
             <w:tcMar>
               <w:top w:w="80" w:type="dxa"/>
@@ -4647,7 +4647,7 @@
         </w:tc>
         <w:tc>
           <w:tcPr>
-            <w:tcW w:w="220" w:type="pct"/>
+            <w:tcW w:w="219" w:type="pct"/>
             <w:shd w:val="clear" w:color="auto" w:fill="C6D9F1" w:themeFill="text2" w:themeFillTint="33"/>
             <w:tcMar>
               <w:top w:w="80" w:type="dxa"/>
@@ -5373,8 +5373,8 @@
         </w:tc>
         <w:tc>
           <w:tcPr>
-            <w:tcW w:w="220" w:type="pct"/>
-            <w:shd w:val="clear" w:color="auto" w:fill="B8CCE4" w:themeFill="accent1" w:themeFillTint="66"/>
+            <w:tcW w:w="219" w:type="pct"/>
+            <w:shd w:val="clear" w:color="auto" w:fill="C6D9F1" w:themeFill="text2" w:themeFillTint="33"/>
             <w:tcMar>
               <w:top w:w="80" w:type="dxa"/>
               <w:left w:w="80" w:type="dxa"/>
@@ -6025,7 +6025,7 @@
         <w:tc>
           <w:tcPr>
             <w:tcW w:w="220" w:type="pct"/>
-            <w:shd w:val="clear" w:color="auto" w:fill="B8CCE4" w:themeFill="accent1" w:themeFillTint="66"/>
+            <w:shd w:val="clear" w:color="auto" w:fill="C6D9F1" w:themeFill="text2" w:themeFillTint="33"/>
             <w:tcMar>
               <w:top w:w="80" w:type="dxa"/>
               <w:left w:w="80" w:type="dxa"/>
@@ -6090,8 +6090,8 @@
         </w:tc>
         <w:tc>
           <w:tcPr>
-            <w:tcW w:w="220" w:type="pct"/>
-            <w:shd w:val="clear" w:color="auto" w:fill="B8CCE4" w:themeFill="accent1" w:themeFillTint="66"/>
+            <w:tcW w:w="219" w:type="pct"/>
+            <w:shd w:val="clear" w:color="auto" w:fill="C6D9F1" w:themeFill="text2" w:themeFillTint="33"/>
             <w:tcMar>
               <w:top w:w="80" w:type="dxa"/>
               <w:left w:w="80" w:type="dxa"/>
@@ -6805,7 +6805,7 @@
         </w:tc>
         <w:tc>
           <w:tcPr>
-            <w:tcW w:w="220" w:type="pct"/>
+            <w:tcW w:w="219" w:type="pct"/>
             <w:shd w:val="clear" w:color="auto" w:fill="FF0000"/>
             <w:tcMar>
               <w:top w:w="80" w:type="dxa"/>
@@ -7544,7 +7544,7 @@
         </w:tc>
         <w:tc>
           <w:tcPr>
-            <w:tcW w:w="220" w:type="pct"/>
+            <w:tcW w:w="219" w:type="pct"/>
             <w:shd w:val="clear" w:color="auto" w:fill="C6D9F1" w:themeFill="text2" w:themeFillTint="33"/>
             <w:tcMar>
               <w:top w:w="80" w:type="dxa"/>
@@ -8144,7 +8144,34 @@
                 <w:sz w:val="16"/>
                 <w:szCs w:val="16"/>
               </w:rPr>
-              <w:t>26.93</w:t>
+              <w:t>65</w:t>
+            </w:r>
+            <w:r>
+              <w:rPr>
+                <w:rFonts w:ascii="Times New Roman" w:hAnsi="Times New Roman" w:cs="Times New Roman"/>
+                <w:color w:val="0F243E" w:themeColor="text2" w:themeShade="80"/>
+                <w:sz w:val="16"/>
+                <w:szCs w:val="16"/>
+              </w:rPr>
+              <w:t>.</w:t>
+            </w:r>
+            <w:r>
+              <w:rPr>
+                <w:rFonts w:ascii="Times New Roman" w:hAnsi="Times New Roman" w:cs="Times New Roman"/>
+                <w:color w:val="0F243E" w:themeColor="text2" w:themeShade="80"/>
+                <w:sz w:val="16"/>
+                <w:szCs w:val="16"/>
+              </w:rPr>
+              <w:t>0</w:t>
+            </w:r>
+            <w:r>
+              <w:rPr>
+                <w:rFonts w:ascii="Times New Roman" w:hAnsi="Times New Roman" w:cs="Times New Roman"/>
+                <w:color w:val="0F243E" w:themeColor="text2" w:themeShade="80"/>
+                <w:sz w:val="16"/>
+                <w:szCs w:val="16"/>
+              </w:rPr>
+              <w:t>3</w:t>
             </w:r>
           </w:p>
         </w:tc>
@@ -8176,7 +8203,7 @@
                 <w:sz w:val="16"/>
                 <w:szCs w:val="16"/>
               </w:rPr>
-              <w:t>22.70</w:t>
+              <w:t>N/A</w:t>
             </w:r>
           </w:p>
         </w:tc>
@@ -8208,7 +8235,7 @@
                 <w:sz w:val="16"/>
                 <w:szCs w:val="16"/>
               </w:rPr>
-              <w:t>0.00</w:t>
+              <w:t>N/A</w:t>
             </w:r>
           </w:p>
         </w:tc>
@@ -8240,39 +8267,39 @@
                 <w:sz w:val="16"/>
                 <w:szCs w:val="16"/>
               </w:rPr>
-              <w:t>26.37</w:t>
-            </w:r>
-          </w:p>
-        </w:tc>
-        <w:tc>
-          <w:tcPr>
-            <w:tcW w:w="220" w:type="pct"/>
-            <w:shd w:val="clear" w:color="auto" w:fill="FF0000"/>
-            <w:tcMar>
-              <w:top w:w="80" w:type="dxa"/>
-              <w:left w:w="80" w:type="dxa"/>
-              <w:bottom w:w="80" w:type="dxa"/>
-              <w:right w:w="80" w:type="dxa"/>
-            </w:tcMar>
-          </w:tcPr>
-          <w:p>
-            <w:pPr>
-              <w:jc w:val="center"/>
-              <w:rPr>
-                <w:rFonts w:ascii="Times New Roman" w:hAnsi="Times New Roman" w:cs="Times New Roman"/>
-                <w:color w:val="0F243E" w:themeColor="text2" w:themeShade="80"/>
-                <w:sz w:val="16"/>
-                <w:szCs w:val="16"/>
-              </w:rPr>
-            </w:pPr>
-            <w:r>
-              <w:rPr>
-                <w:rFonts w:ascii="Times New Roman" w:hAnsi="Times New Roman" w:cs="Times New Roman"/>
-                <w:color w:val="FFFFFF" w:themeColor="background1"/>
-                <w:sz w:val="16"/>
-                <w:szCs w:val="16"/>
-              </w:rPr>
-              <w:t>INF</w:t>
+              <w:t>N/A</w:t>
+            </w:r>
+          </w:p>
+        </w:tc>
+        <w:tc>
+          <w:tcPr>
+            <w:tcW w:w="219" w:type="pct"/>
+            <w:shd w:val="clear" w:color="auto" w:fill="C6D9F1" w:themeFill="text2" w:themeFillTint="33"/>
+            <w:tcMar>
+              <w:top w:w="80" w:type="dxa"/>
+              <w:left w:w="80" w:type="dxa"/>
+              <w:bottom w:w="80" w:type="dxa"/>
+              <w:right w:w="80" w:type="dxa"/>
+            </w:tcMar>
+          </w:tcPr>
+          <w:p>
+            <w:pPr>
+              <w:jc w:val="center"/>
+              <w:rPr>
+                <w:rFonts w:ascii="Times New Roman" w:hAnsi="Times New Roman" w:cs="Times New Roman"/>
+                <w:color w:val="0F243E" w:themeColor="text2" w:themeShade="80"/>
+                <w:sz w:val="16"/>
+                <w:szCs w:val="16"/>
+              </w:rPr>
+            </w:pPr>
+            <w:r>
+              <w:rPr>
+                <w:rFonts w:ascii="Times New Roman" w:hAnsi="Times New Roman" w:cs="Times New Roman"/>
+                <w:color w:val="0F243E" w:themeColor="text2" w:themeShade="80"/>
+                <w:sz w:val="16"/>
+                <w:szCs w:val="16"/>
+              </w:rPr>
+              <w:t>N/A</w:t>
             </w:r>
           </w:p>
         </w:tc>
@@ -9034,7 +9061,7 @@
         </w:tc>
         <w:tc>
           <w:tcPr>
-            <w:tcW w:w="220" w:type="pct"/>
+            <w:tcW w:w="219" w:type="pct"/>
             <w:shd w:val="clear" w:color="auto" w:fill="C6D9F1" w:themeFill="text2" w:themeFillTint="33"/>
             <w:tcMar>
               <w:top w:w="80" w:type="dxa"/>
@@ -9748,7 +9775,7 @@
         </w:tc>
         <w:tc>
           <w:tcPr>
-            <w:tcW w:w="220" w:type="pct"/>
+            <w:tcW w:w="219" w:type="pct"/>
             <w:shd w:val="clear" w:color="auto" w:fill="C6D9F1" w:themeFill="text2" w:themeFillTint="33"/>
             <w:tcMar>
               <w:top w:w="80" w:type="dxa"/>
@@ -10462,7 +10489,7 @@
         </w:tc>
         <w:tc>
           <w:tcPr>
-            <w:tcW w:w="220" w:type="pct"/>
+            <w:tcW w:w="219" w:type="pct"/>
             <w:shd w:val="clear" w:color="auto" w:fill="C6D9F1" w:themeFill="text2" w:themeFillTint="33"/>
             <w:tcMar>
               <w:top w:w="80" w:type="dxa"/>
@@ -11093,7 +11120,34 @@
                 <w:sz w:val="16"/>
                 <w:szCs w:val="16"/>
               </w:rPr>
-              <w:t>26.93</w:t>
+              <w:t>64</w:t>
+            </w:r>
+            <w:r>
+              <w:rPr>
+                <w:rFonts w:ascii="Times New Roman" w:hAnsi="Times New Roman" w:cs="Times New Roman"/>
+                <w:color w:val="0F243E" w:themeColor="text2" w:themeShade="80"/>
+                <w:sz w:val="16"/>
+                <w:szCs w:val="16"/>
+              </w:rPr>
+              <w:t>.</w:t>
+            </w:r>
+            <w:r>
+              <w:rPr>
+                <w:rFonts w:ascii="Times New Roman" w:hAnsi="Times New Roman" w:cs="Times New Roman"/>
+                <w:color w:val="0F243E" w:themeColor="text2" w:themeShade="80"/>
+                <w:sz w:val="16"/>
+                <w:szCs w:val="16"/>
+              </w:rPr>
+              <w:t>0</w:t>
+            </w:r>
+            <w:r>
+              <w:rPr>
+                <w:rFonts w:ascii="Times New Roman" w:hAnsi="Times New Roman" w:cs="Times New Roman"/>
+                <w:color w:val="0F243E" w:themeColor="text2" w:themeShade="80"/>
+                <w:sz w:val="16"/>
+                <w:szCs w:val="16"/>
+              </w:rPr>
+              <w:t>1</w:t>
             </w:r>
           </w:p>
         </w:tc>
@@ -11125,39 +11179,7 @@
                 <w:sz w:val="16"/>
                 <w:szCs w:val="16"/>
               </w:rPr>
-              <w:t>19.76</w:t>
-            </w:r>
-          </w:p>
-        </w:tc>
-        <w:tc>
-          <w:tcPr>
-            <w:tcW w:w="220" w:type="pct"/>
-            <w:shd w:val="clear" w:color="auto" w:fill="B8CCE4" w:themeFill="accent1" w:themeFillTint="66"/>
-            <w:tcMar>
-              <w:top w:w="80" w:type="dxa"/>
-              <w:left w:w="80" w:type="dxa"/>
-              <w:bottom w:w="80" w:type="dxa"/>
-              <w:right w:w="80" w:type="dxa"/>
-            </w:tcMar>
-          </w:tcPr>
-          <w:p>
-            <w:pPr>
-              <w:jc w:val="center"/>
-              <w:rPr>
-                <w:rFonts w:ascii="Times New Roman" w:hAnsi="Times New Roman" w:cs="Times New Roman"/>
-                <w:color w:val="0F243E" w:themeColor="text2" w:themeShade="80"/>
-                <w:sz w:val="16"/>
-                <w:szCs w:val="16"/>
-              </w:rPr>
-            </w:pPr>
-            <w:r>
-              <w:rPr>
-                <w:rFonts w:ascii="Times New Roman" w:hAnsi="Times New Roman" w:cs="Times New Roman"/>
-                <w:color w:val="0F243E" w:themeColor="text2" w:themeShade="80"/>
-                <w:sz w:val="16"/>
-                <w:szCs w:val="16"/>
-              </w:rPr>
-              <w:t>0.00</w:t>
+              <w:t>N/A</w:t>
             </w:r>
           </w:p>
         </w:tc>
@@ -11189,39 +11211,71 @@
                 <w:sz w:val="16"/>
                 <w:szCs w:val="16"/>
               </w:rPr>
-              <w:t>26.02</w:t>
+              <w:t>N/A</w:t>
             </w:r>
           </w:p>
         </w:tc>
         <w:tc>
           <w:tcPr>
             <w:tcW w:w="220" w:type="pct"/>
-            <w:shd w:val="clear" w:color="auto" w:fill="FF0000"/>
-            <w:tcMar>
-              <w:top w:w="80" w:type="dxa"/>
-              <w:left w:w="80" w:type="dxa"/>
-              <w:bottom w:w="80" w:type="dxa"/>
-              <w:right w:w="80" w:type="dxa"/>
-            </w:tcMar>
-          </w:tcPr>
-          <w:p>
-            <w:pPr>
-              <w:jc w:val="center"/>
-              <w:rPr>
-                <w:rFonts w:ascii="Times New Roman" w:hAnsi="Times New Roman" w:cs="Times New Roman"/>
-                <w:color w:val="0F243E" w:themeColor="text2" w:themeShade="80"/>
-                <w:sz w:val="16"/>
-                <w:szCs w:val="16"/>
-              </w:rPr>
-            </w:pPr>
-            <w:r>
-              <w:rPr>
-                <w:rFonts w:ascii="Times New Roman" w:hAnsi="Times New Roman" w:cs="Times New Roman"/>
-                <w:color w:val="FFFFFF" w:themeColor="background1"/>
-                <w:sz w:val="16"/>
-                <w:szCs w:val="16"/>
-              </w:rPr>
-              <w:t>INF</w:t>
+            <w:shd w:val="clear" w:color="auto" w:fill="C6D9F1" w:themeFill="text2" w:themeFillTint="33"/>
+            <w:tcMar>
+              <w:top w:w="80" w:type="dxa"/>
+              <w:left w:w="80" w:type="dxa"/>
+              <w:bottom w:w="80" w:type="dxa"/>
+              <w:right w:w="80" w:type="dxa"/>
+            </w:tcMar>
+          </w:tcPr>
+          <w:p>
+            <w:pPr>
+              <w:jc w:val="center"/>
+              <w:rPr>
+                <w:rFonts w:ascii="Times New Roman" w:hAnsi="Times New Roman" w:cs="Times New Roman"/>
+                <w:color w:val="0F243E" w:themeColor="text2" w:themeShade="80"/>
+                <w:sz w:val="16"/>
+                <w:szCs w:val="16"/>
+              </w:rPr>
+            </w:pPr>
+            <w:r>
+              <w:rPr>
+                <w:rFonts w:ascii="Times New Roman" w:hAnsi="Times New Roman" w:cs="Times New Roman"/>
+                <w:color w:val="0F243E" w:themeColor="text2" w:themeShade="80"/>
+                <w:sz w:val="16"/>
+                <w:szCs w:val="16"/>
+              </w:rPr>
+              <w:t>N/A</w:t>
+            </w:r>
+          </w:p>
+        </w:tc>
+        <w:tc>
+          <w:tcPr>
+            <w:tcW w:w="219" w:type="pct"/>
+            <w:shd w:val="clear" w:color="auto" w:fill="C6D9F1" w:themeFill="text2" w:themeFillTint="33"/>
+            <w:tcMar>
+              <w:top w:w="80" w:type="dxa"/>
+              <w:left w:w="80" w:type="dxa"/>
+              <w:bottom w:w="80" w:type="dxa"/>
+              <w:right w:w="80" w:type="dxa"/>
+            </w:tcMar>
+          </w:tcPr>
+          <w:p>
+            <w:pPr>
+              <w:jc w:val="center"/>
+              <w:rPr>
+                <w:rFonts w:ascii="Times New Roman" w:hAnsi="Times New Roman" w:cs="Times New Roman"/>
+                <w:color w:val="0F243E" w:themeColor="text2" w:themeShade="80"/>
+                <w:sz w:val="16"/>
+                <w:szCs w:val="16"/>
+              </w:rPr>
+            </w:pPr>
+            <w:r>
+              <w:rPr>
+                <w:rFonts w:ascii="Times New Roman" w:hAnsi="Times New Roman" w:cs="Times New Roman"/>
+                <w:color w:val="0F243E" w:themeColor="text2" w:themeShade="80"/>
+                <w:sz w:val="16"/>
+                <w:szCs w:val="16"/>
+              </w:rPr>
+              <w:t>N/A</w:t>
             </w:r>
           </w:p>
         </w:tc>
@@ -11808,7 +11862,25 @@
                 <w:sz w:val="16"/>
                 <w:szCs w:val="16"/>
               </w:rPr>
-              <w:t>26.65</w:t>
+              <w:t>40</w:t>
+            </w:r>
+            <w:r>
+              <w:rPr>
+                <w:rFonts w:ascii="Times New Roman" w:hAnsi="Times New Roman" w:cs="Times New Roman"/>
+                <w:color w:val="0F243E" w:themeColor="text2" w:themeShade="80"/>
+                <w:sz w:val="16"/>
+                <w:szCs w:val="16"/>
+              </w:rPr>
+              <w:t>.</w:t>
+            </w:r>
+            <w:r>
+              <w:rPr>
+                <w:rFonts w:ascii="Times New Roman" w:hAnsi="Times New Roman" w:cs="Times New Roman"/>
+                <w:color w:val="0F243E" w:themeColor="text2" w:themeShade="80"/>
+                <w:sz w:val="16"/>
+                <w:szCs w:val="16"/>
+              </w:rPr>
+              <w:t>01</w:t>
             </w:r>
           </w:p>
         </w:tc>
@@ -11840,39 +11912,7 @@
                 <w:sz w:val="16"/>
                 <w:szCs w:val="16"/>
               </w:rPr>
-              <w:t>18.11</w:t>
-            </w:r>
-          </w:p>
-        </w:tc>
-        <w:tc>
-          <w:tcPr>
-            <w:tcW w:w="220" w:type="pct"/>
-            <w:shd w:val="clear" w:color="auto" w:fill="B8CCE4" w:themeFill="accent1" w:themeFillTint="66"/>
-            <w:tcMar>
-              <w:top w:w="80" w:type="dxa"/>
-              <w:left w:w="80" w:type="dxa"/>
-              <w:bottom w:w="80" w:type="dxa"/>
-              <w:right w:w="80" w:type="dxa"/>
-            </w:tcMar>
-          </w:tcPr>
-          <w:p>
-            <w:pPr>
-              <w:jc w:val="center"/>
-              <w:rPr>
-                <w:rFonts w:ascii="Times New Roman" w:hAnsi="Times New Roman" w:cs="Times New Roman"/>
-                <w:color w:val="0F243E" w:themeColor="text2" w:themeShade="80"/>
-                <w:sz w:val="16"/>
-                <w:szCs w:val="16"/>
-              </w:rPr>
-            </w:pPr>
-            <w:r>
-              <w:rPr>
-                <w:rFonts w:ascii="Times New Roman" w:hAnsi="Times New Roman" w:cs="Times New Roman"/>
-                <w:color w:val="0F243E" w:themeColor="text2" w:themeShade="80"/>
-                <w:sz w:val="16"/>
-                <w:szCs w:val="16"/>
-              </w:rPr>
-              <w:t>0.00</w:t>
+              <w:t>N/A</w:t>
             </w:r>
           </w:p>
         </w:tc>
@@ -11904,39 +11944,71 @@
                 <w:sz w:val="16"/>
                 <w:szCs w:val="16"/>
               </w:rPr>
-              <w:t>25.94</w:t>
+              <w:t>N/A</w:t>
             </w:r>
           </w:p>
         </w:tc>
         <w:tc>
           <w:tcPr>
             <w:tcW w:w="220" w:type="pct"/>
-            <w:shd w:val="clear" w:color="auto" w:fill="FF0000"/>
-            <w:tcMar>
-              <w:top w:w="80" w:type="dxa"/>
-              <w:left w:w="80" w:type="dxa"/>
-              <w:bottom w:w="80" w:type="dxa"/>
-              <w:right w:w="80" w:type="dxa"/>
-            </w:tcMar>
-          </w:tcPr>
-          <w:p>
-            <w:pPr>
-              <w:jc w:val="center"/>
-              <w:rPr>
-                <w:rFonts w:ascii="Times New Roman" w:hAnsi="Times New Roman" w:cs="Times New Roman"/>
-                <w:color w:val="0F243E" w:themeColor="text2" w:themeShade="80"/>
-                <w:sz w:val="16"/>
-                <w:szCs w:val="16"/>
-              </w:rPr>
-            </w:pPr>
-            <w:r>
-              <w:rPr>
-                <w:rFonts w:ascii="Times New Roman" w:hAnsi="Times New Roman" w:cs="Times New Roman"/>
-                <w:color w:val="FFFFFF" w:themeColor="background1"/>
-                <w:sz w:val="16"/>
-                <w:szCs w:val="16"/>
-              </w:rPr>
-              <w:t>INF</w:t>
+            <w:shd w:val="clear" w:color="auto" w:fill="C6D9F1" w:themeFill="text2" w:themeFillTint="33"/>
+            <w:tcMar>
+              <w:top w:w="80" w:type="dxa"/>
+              <w:left w:w="80" w:type="dxa"/>
+              <w:bottom w:w="80" w:type="dxa"/>
+              <w:right w:w="80" w:type="dxa"/>
+            </w:tcMar>
+          </w:tcPr>
+          <w:p>
+            <w:pPr>
+              <w:jc w:val="center"/>
+              <w:rPr>
+                <w:rFonts w:ascii="Times New Roman" w:hAnsi="Times New Roman" w:cs="Times New Roman"/>
+                <w:color w:val="0F243E" w:themeColor="text2" w:themeShade="80"/>
+                <w:sz w:val="16"/>
+                <w:szCs w:val="16"/>
+              </w:rPr>
+            </w:pPr>
+            <w:r>
+              <w:rPr>
+                <w:rFonts w:ascii="Times New Roman" w:hAnsi="Times New Roman" w:cs="Times New Roman"/>
+                <w:color w:val="0F243E" w:themeColor="text2" w:themeShade="80"/>
+                <w:sz w:val="16"/>
+                <w:szCs w:val="16"/>
+              </w:rPr>
+              <w:t>N/A</w:t>
+            </w:r>
+          </w:p>
+        </w:tc>
+        <w:tc>
+          <w:tcPr>
+            <w:tcW w:w="219" w:type="pct"/>
+            <w:shd w:val="clear" w:color="auto" w:fill="C6D9F1" w:themeFill="text2" w:themeFillTint="33"/>
+            <w:tcMar>
+              <w:top w:w="80" w:type="dxa"/>
+              <w:left w:w="80" w:type="dxa"/>
+              <w:bottom w:w="80" w:type="dxa"/>
+              <w:right w:w="80" w:type="dxa"/>
+            </w:tcMar>
+          </w:tcPr>
+          <w:p>
+            <w:pPr>
+              <w:jc w:val="center"/>
+              <w:rPr>
+                <w:rFonts w:ascii="Times New Roman" w:hAnsi="Times New Roman" w:cs="Times New Roman"/>
+                <w:color w:val="0F243E" w:themeColor="text2" w:themeShade="80"/>
+                <w:sz w:val="16"/>
+                <w:szCs w:val="16"/>
+              </w:rPr>
+            </w:pPr>
+            <w:r>
+              <w:rPr>
+                <w:rFonts w:ascii="Times New Roman" w:hAnsi="Times New Roman" w:cs="Times New Roman"/>
+                <w:color w:val="0F243E" w:themeColor="text2" w:themeShade="80"/>
+                <w:sz w:val="16"/>
+                <w:szCs w:val="16"/>
+              </w:rPr>
+              <w:t>N/A</w:t>
             </w:r>
           </w:p>
         </w:tc>
@@ -12523,7 +12595,34 @@
                 <w:sz w:val="16"/>
                 <w:szCs w:val="16"/>
               </w:rPr>
-              <w:t>24.63</w:t>
+              <w:t>24</w:t>
+            </w:r>
+            <w:r>
+              <w:rPr>
+                <w:rFonts w:ascii="Times New Roman" w:hAnsi="Times New Roman" w:cs="Times New Roman"/>
+                <w:color w:val="0F243E" w:themeColor="text2" w:themeShade="80"/>
+                <w:sz w:val="16"/>
+                <w:szCs w:val="16"/>
+              </w:rPr>
+              <w:t>.</w:t>
+            </w:r>
+            <w:r>
+              <w:rPr>
+                <w:rFonts w:ascii="Times New Roman" w:hAnsi="Times New Roman" w:cs="Times New Roman"/>
+                <w:color w:val="0F243E" w:themeColor="text2" w:themeShade="80"/>
+                <w:sz w:val="16"/>
+                <w:szCs w:val="16"/>
+              </w:rPr>
+              <w:t>0</w:t>
+            </w:r>
+            <w:r>
+              <w:rPr>
+                <w:rFonts w:ascii="Times New Roman" w:hAnsi="Times New Roman" w:cs="Times New Roman"/>
+                <w:color w:val="0F243E" w:themeColor="text2" w:themeShade="80"/>
+                <w:sz w:val="16"/>
+                <w:szCs w:val="16"/>
+              </w:rPr>
+              <w:t>8</w:t>
             </w:r>
           </w:p>
         </w:tc>
@@ -12555,7 +12654,7 @@
                 <w:sz w:val="16"/>
                 <w:szCs w:val="16"/>
               </w:rPr>
-              <w:t>17.65</w:t>
+              <w:t>N/A</w:t>
             </w:r>
           </w:p>
         </w:tc>
@@ -12587,7 +12686,7 @@
                 <w:sz w:val="16"/>
                 <w:szCs w:val="16"/>
               </w:rPr>
-              <w:t>0.00</w:t>
+              <w:t>N/A</w:t>
             </w:r>
           </w:p>
         </w:tc>
@@ -12619,39 +12718,39 @@
                 <w:sz w:val="16"/>
                 <w:szCs w:val="16"/>
               </w:rPr>
-              <w:t>26.88</w:t>
-            </w:r>
-          </w:p>
-        </w:tc>
-        <w:tc>
-          <w:tcPr>
-            <w:tcW w:w="220" w:type="pct"/>
-            <w:shd w:val="clear" w:color="auto" w:fill="FF0000"/>
-            <w:tcMar>
-              <w:top w:w="80" w:type="dxa"/>
-              <w:left w:w="80" w:type="dxa"/>
-              <w:bottom w:w="80" w:type="dxa"/>
-              <w:right w:w="80" w:type="dxa"/>
-            </w:tcMar>
-          </w:tcPr>
-          <w:p>
-            <w:pPr>
-              <w:jc w:val="center"/>
-              <w:rPr>
-                <w:rFonts w:ascii="Times New Roman" w:hAnsi="Times New Roman" w:cs="Times New Roman"/>
-                <w:color w:val="0F243E" w:themeColor="text2" w:themeShade="80"/>
-                <w:sz w:val="16"/>
-                <w:szCs w:val="16"/>
-              </w:rPr>
-            </w:pPr>
-            <w:r>
-              <w:rPr>
-                <w:rFonts w:ascii="Times New Roman" w:hAnsi="Times New Roman" w:cs="Times New Roman"/>
-                <w:color w:val="FFFFFF" w:themeColor="background1"/>
-                <w:sz w:val="16"/>
-                <w:szCs w:val="16"/>
-              </w:rPr>
-              <w:t>INF</w:t>
+              <w:t>N/A</w:t>
+            </w:r>
+          </w:p>
+        </w:tc>
+        <w:tc>
+          <w:tcPr>
+            <w:tcW w:w="219" w:type="pct"/>
+            <w:shd w:val="clear" w:color="auto" w:fill="C6D9F1" w:themeFill="text2" w:themeFillTint="33"/>
+            <w:tcMar>
+              <w:top w:w="80" w:type="dxa"/>
+              <w:left w:w="80" w:type="dxa"/>
+              <w:bottom w:w="80" w:type="dxa"/>
+              <w:right w:w="80" w:type="dxa"/>
+            </w:tcMar>
+          </w:tcPr>
+          <w:p>
+            <w:pPr>
+              <w:jc w:val="center"/>
+              <w:rPr>
+                <w:rFonts w:ascii="Times New Roman" w:hAnsi="Times New Roman" w:cs="Times New Roman"/>
+                <w:color w:val="0F243E" w:themeColor="text2" w:themeShade="80"/>
+                <w:sz w:val="16"/>
+                <w:szCs w:val="16"/>
+              </w:rPr>
+            </w:pPr>
+            <w:r>
+              <w:rPr>
+                <w:rFonts w:ascii="Times New Roman" w:hAnsi="Times New Roman" w:cs="Times New Roman"/>
+                <w:color w:val="0F243E" w:themeColor="text2" w:themeShade="80"/>
+                <w:sz w:val="16"/>
+                <w:szCs w:val="16"/>
+              </w:rPr>
+              <w:t>N/A</w:t>
             </w:r>
           </w:p>
         </w:tc>
@@ -13368,7 +13467,7 @@
         </w:tc>
         <w:tc>
           <w:tcPr>
-            <w:tcW w:w="220" w:type="pct"/>
+            <w:tcW w:w="219" w:type="pct"/>
             <w:shd w:val="clear" w:color="auto" w:fill="C6D9F1" w:themeFill="text2" w:themeFillTint="33"/>
             <w:tcMar>
               <w:top w:w="80" w:type="dxa"/>
@@ -14082,7 +14181,7 @@
         </w:tc>
         <w:tc>
           <w:tcPr>
-            <w:tcW w:w="220" w:type="pct"/>
+            <w:tcW w:w="219" w:type="pct"/>
             <w:shd w:val="clear" w:color="auto" w:fill="C6D9F1" w:themeFill="text2" w:themeFillTint="33"/>
             <w:tcMar>
               <w:top w:w="80" w:type="dxa"/>
@@ -14796,7 +14895,7 @@
         </w:tc>
         <w:tc>
           <w:tcPr>
-            <w:tcW w:w="220" w:type="pct"/>
+            <w:tcW w:w="219" w:type="pct"/>
             <w:shd w:val="clear" w:color="auto" w:fill="FF0000"/>
             <w:tcMar>
               <w:top w:w="80" w:type="dxa"/>
@@ -15438,7 +15537,25 @@
                 <w:sz w:val="16"/>
                 <w:szCs w:val="16"/>
               </w:rPr>
-              <w:t>26.93</w:t>
+              <w:t>64</w:t>
+            </w:r>
+            <w:r>
+              <w:rPr>
+                <w:rFonts w:ascii="Times New Roman" w:hAnsi="Times New Roman" w:cs="Times New Roman"/>
+                <w:color w:val="0F243E" w:themeColor="text2" w:themeShade="80"/>
+                <w:sz w:val="16"/>
+                <w:szCs w:val="16"/>
+              </w:rPr>
+              <w:t>.</w:t>
+            </w:r>
+            <w:r>
+              <w:rPr>
+                <w:rFonts w:ascii="Times New Roman" w:hAnsi="Times New Roman" w:cs="Times New Roman"/>
+                <w:color w:val="0F243E" w:themeColor="text2" w:themeShade="80"/>
+                <w:sz w:val="16"/>
+                <w:szCs w:val="16"/>
+              </w:rPr>
+              <w:t>32</w:t>
             </w:r>
           </w:p>
         </w:tc>
@@ -15470,7 +15587,7 @@
                 <w:sz w:val="16"/>
                 <w:szCs w:val="16"/>
               </w:rPr>
-              <w:t>20.32</w:t>
+              <w:t>N/A</w:t>
             </w:r>
           </w:p>
         </w:tc>
@@ -15502,7 +15619,7 @@
                 <w:sz w:val="16"/>
                 <w:szCs w:val="16"/>
               </w:rPr>
-              <w:t>0.00</w:t>
+              <w:t>N/A</w:t>
             </w:r>
           </w:p>
         </w:tc>
@@ -15534,39 +15651,39 @@
                 <w:sz w:val="16"/>
                 <w:szCs w:val="16"/>
               </w:rPr>
-              <w:t>26.02</w:t>
-            </w:r>
-          </w:p>
-        </w:tc>
-        <w:tc>
-          <w:tcPr>
-            <w:tcW w:w="220" w:type="pct"/>
-            <w:shd w:val="clear" w:color="auto" w:fill="FF0000"/>
-            <w:tcMar>
-              <w:top w:w="80" w:type="dxa"/>
-              <w:left w:w="80" w:type="dxa"/>
-              <w:bottom w:w="80" w:type="dxa"/>
-              <w:right w:w="80" w:type="dxa"/>
-            </w:tcMar>
-          </w:tcPr>
-          <w:p>
-            <w:pPr>
-              <w:jc w:val="center"/>
-              <w:rPr>
-                <w:rFonts w:ascii="Times New Roman" w:hAnsi="Times New Roman" w:cs="Times New Roman"/>
-                <w:color w:val="0F243E" w:themeColor="text2" w:themeShade="80"/>
-                <w:sz w:val="16"/>
-                <w:szCs w:val="16"/>
-              </w:rPr>
-            </w:pPr>
-            <w:r>
-              <w:rPr>
-                <w:rFonts w:ascii="Times New Roman" w:hAnsi="Times New Roman" w:cs="Times New Roman"/>
-                <w:color w:val="FFFFFF" w:themeColor="background1"/>
-                <w:sz w:val="16"/>
-                <w:szCs w:val="16"/>
-              </w:rPr>
-              <w:t>INF</w:t>
+              <w:t>N/A</w:t>
+            </w:r>
+          </w:p>
+        </w:tc>
+        <w:tc>
+          <w:tcPr>
+            <w:tcW w:w="219" w:type="pct"/>
+            <w:shd w:val="clear" w:color="auto" w:fill="C6D9F1" w:themeFill="text2" w:themeFillTint="33"/>
+            <w:tcMar>
+              <w:top w:w="80" w:type="dxa"/>
+              <w:left w:w="80" w:type="dxa"/>
+              <w:bottom w:w="80" w:type="dxa"/>
+              <w:right w:w="80" w:type="dxa"/>
+            </w:tcMar>
+          </w:tcPr>
+          <w:p>
+            <w:pPr>
+              <w:jc w:val="center"/>
+              <w:rPr>
+                <w:rFonts w:ascii="Times New Roman" w:hAnsi="Times New Roman" w:cs="Times New Roman"/>
+                <w:color w:val="0F243E" w:themeColor="text2" w:themeShade="80"/>
+                <w:sz w:val="16"/>
+                <w:szCs w:val="16"/>
+              </w:rPr>
+            </w:pPr>
+            <w:r>
+              <w:rPr>
+                <w:rFonts w:ascii="Times New Roman" w:hAnsi="Times New Roman" w:cs="Times New Roman"/>
+                <w:color w:val="0F243E" w:themeColor="text2" w:themeShade="80"/>
+                <w:sz w:val="16"/>
+                <w:szCs w:val="16"/>
+              </w:rPr>
+              <w:t>N/A</w:t>
             </w:r>
           </w:p>
         </w:tc>
@@ -16153,7 +16270,7 @@
                 <w:sz w:val="16"/>
                 <w:szCs w:val="16"/>
               </w:rPr>
-              <w:t>22.91</w:t>
+              <w:t>N/A</w:t>
             </w:r>
           </w:p>
         </w:tc>
@@ -16185,7 +16302,7 @@
                 <w:sz w:val="16"/>
                 <w:szCs w:val="16"/>
               </w:rPr>
-              <w:t>19.20</w:t>
+              <w:t>N/A</w:t>
             </w:r>
           </w:p>
         </w:tc>
@@ -16217,7 +16334,7 @@
                 <w:sz w:val="16"/>
                 <w:szCs w:val="16"/>
               </w:rPr>
-              <w:t>0.00</w:t>
+              <w:t>N/A</w:t>
             </w:r>
           </w:p>
         </w:tc>
@@ -16249,39 +16366,39 @@
                 <w:sz w:val="16"/>
                 <w:szCs w:val="16"/>
               </w:rPr>
-              <w:t>27.65</w:t>
-            </w:r>
-          </w:p>
-        </w:tc>
-        <w:tc>
-          <w:tcPr>
-            <w:tcW w:w="220" w:type="pct"/>
-            <w:shd w:val="clear" w:color="auto" w:fill="FF0000"/>
-            <w:tcMar>
-              <w:top w:w="80" w:type="dxa"/>
-              <w:left w:w="80" w:type="dxa"/>
-              <w:bottom w:w="80" w:type="dxa"/>
-              <w:right w:w="80" w:type="dxa"/>
-            </w:tcMar>
-          </w:tcPr>
-          <w:p>
-            <w:pPr>
-              <w:jc w:val="center"/>
-              <w:rPr>
-                <w:rFonts w:ascii="Times New Roman" w:hAnsi="Times New Roman" w:cs="Times New Roman"/>
-                <w:color w:val="0F243E" w:themeColor="text2" w:themeShade="80"/>
-                <w:sz w:val="16"/>
-                <w:szCs w:val="16"/>
-              </w:rPr>
-            </w:pPr>
-            <w:r>
-              <w:rPr>
-                <w:rFonts w:ascii="Times New Roman" w:hAnsi="Times New Roman" w:cs="Times New Roman"/>
-                <w:color w:val="FFFFFF" w:themeColor="background1"/>
-                <w:sz w:val="16"/>
-                <w:szCs w:val="16"/>
-              </w:rPr>
-              <w:t>INF</w:t>
+              <w:t>N/A</w:t>
+            </w:r>
+          </w:p>
+        </w:tc>
+        <w:tc>
+          <w:tcPr>
+            <w:tcW w:w="219" w:type="pct"/>
+            <w:shd w:val="clear" w:color="auto" w:fill="C6D9F1" w:themeFill="text2" w:themeFillTint="33"/>
+            <w:tcMar>
+              <w:top w:w="80" w:type="dxa"/>
+              <w:left w:w="80" w:type="dxa"/>
+              <w:bottom w:w="80" w:type="dxa"/>
+              <w:right w:w="80" w:type="dxa"/>
+            </w:tcMar>
+          </w:tcPr>
+          <w:p>
+            <w:pPr>
+              <w:jc w:val="center"/>
+              <w:rPr>
+                <w:rFonts w:ascii="Times New Roman" w:hAnsi="Times New Roman" w:cs="Times New Roman"/>
+                <w:color w:val="0F243E" w:themeColor="text2" w:themeShade="80"/>
+                <w:sz w:val="16"/>
+                <w:szCs w:val="16"/>
+              </w:rPr>
+            </w:pPr>
+            <w:r>
+              <w:rPr>
+                <w:rFonts w:ascii="Times New Roman" w:hAnsi="Times New Roman" w:cs="Times New Roman"/>
+                <w:color w:val="0F243E" w:themeColor="text2" w:themeShade="80"/>
+                <w:sz w:val="16"/>
+                <w:szCs w:val="16"/>
+              </w:rPr>
+              <w:t>N/A</w:t>
             </w:r>
           </w:p>
         </w:tc>
@@ -16868,7 +16985,34 @@
                 <w:sz w:val="16"/>
                 <w:szCs w:val="16"/>
               </w:rPr>
-              <w:t>22.91</w:t>
+              <w:t>24</w:t>
+            </w:r>
+            <w:r>
+              <w:rPr>
+                <w:rFonts w:ascii="Times New Roman" w:hAnsi="Times New Roman" w:cs="Times New Roman"/>
+                <w:color w:val="0F243E" w:themeColor="text2" w:themeShade="80"/>
+                <w:sz w:val="16"/>
+                <w:szCs w:val="16"/>
+              </w:rPr>
+              <w:t>.</w:t>
+            </w:r>
+            <w:r>
+              <w:rPr>
+                <w:rFonts w:ascii="Times New Roman" w:hAnsi="Times New Roman" w:cs="Times New Roman"/>
+                <w:color w:val="0F243E" w:themeColor="text2" w:themeShade="80"/>
+                <w:sz w:val="16"/>
+                <w:szCs w:val="16"/>
+              </w:rPr>
+              <w:t>0</w:t>
+            </w:r>
+            <w:r>
+              <w:rPr>
+                <w:rFonts w:ascii="Times New Roman" w:hAnsi="Times New Roman" w:cs="Times New Roman"/>
+                <w:color w:val="0F243E" w:themeColor="text2" w:themeShade="80"/>
+                <w:sz w:val="16"/>
+                <w:szCs w:val="16"/>
+              </w:rPr>
+              <w:t>6</w:t>
             </w:r>
           </w:p>
         </w:tc>
@@ -16900,7 +17044,7 @@
                 <w:sz w:val="16"/>
                 <w:szCs w:val="16"/>
               </w:rPr>
-              <w:t>18.97</w:t>
+              <w:t>N/A</w:t>
             </w:r>
           </w:p>
         </w:tc>
@@ -16932,7 +17076,7 @@
                 <w:sz w:val="16"/>
                 <w:szCs w:val="16"/>
               </w:rPr>
-              <w:t>0.00</w:t>
+              <w:t>N/A</w:t>
             </w:r>
           </w:p>
         </w:tc>
@@ -16964,39 +17108,39 @@
                 <w:sz w:val="16"/>
                 <w:szCs w:val="16"/>
               </w:rPr>
-              <w:t>28.67</w:t>
-            </w:r>
-          </w:p>
-        </w:tc>
-        <w:tc>
-          <w:tcPr>
-            <w:tcW w:w="220" w:type="pct"/>
-            <w:shd w:val="clear" w:color="auto" w:fill="FF0000"/>
-            <w:tcMar>
-              <w:top w:w="80" w:type="dxa"/>
-              <w:left w:w="80" w:type="dxa"/>
-              <w:bottom w:w="80" w:type="dxa"/>
-              <w:right w:w="80" w:type="dxa"/>
-            </w:tcMar>
-          </w:tcPr>
-          <w:p>
-            <w:pPr>
-              <w:jc w:val="center"/>
-              <w:rPr>
-                <w:rFonts w:ascii="Times New Roman" w:hAnsi="Times New Roman" w:cs="Times New Roman"/>
-                <w:color w:val="0F243E" w:themeColor="text2" w:themeShade="80"/>
-                <w:sz w:val="16"/>
-                <w:szCs w:val="16"/>
-              </w:rPr>
-            </w:pPr>
-            <w:r>
-              <w:rPr>
-                <w:rFonts w:ascii="Times New Roman" w:hAnsi="Times New Roman" w:cs="Times New Roman"/>
-                <w:color w:val="FFFFFF" w:themeColor="background1"/>
-                <w:sz w:val="16"/>
-                <w:szCs w:val="16"/>
-              </w:rPr>
-              <w:t>INF</w:t>
+              <w:t>N/A</w:t>
+            </w:r>
+          </w:p>
+        </w:tc>
+        <w:tc>
+          <w:tcPr>
+            <w:tcW w:w="219" w:type="pct"/>
+            <w:shd w:val="clear" w:color="auto" w:fill="C6D9F1" w:themeFill="text2" w:themeFillTint="33"/>
+            <w:tcMar>
+              <w:top w:w="80" w:type="dxa"/>
+              <w:left w:w="80" w:type="dxa"/>
+              <w:bottom w:w="80" w:type="dxa"/>
+              <w:right w:w="80" w:type="dxa"/>
+            </w:tcMar>
+          </w:tcPr>
+          <w:p>
+            <w:pPr>
+              <w:jc w:val="center"/>
+              <w:rPr>
+                <w:rFonts w:ascii="Times New Roman" w:hAnsi="Times New Roman" w:cs="Times New Roman"/>
+                <w:color w:val="0F243E" w:themeColor="text2" w:themeShade="80"/>
+                <w:sz w:val="16"/>
+                <w:szCs w:val="16"/>
+              </w:rPr>
+            </w:pPr>
+            <w:r>
+              <w:rPr>
+                <w:rFonts w:ascii="Times New Roman" w:hAnsi="Times New Roman" w:cs="Times New Roman"/>
+                <w:color w:val="0F243E" w:themeColor="text2" w:themeShade="80"/>
+                <w:sz w:val="16"/>
+                <w:szCs w:val="16"/>
+              </w:rPr>
+              <w:t>N/A</w:t>
             </w:r>
           </w:p>
         </w:tc>

</xml_diff>